<commit_message>
Fixed the method of service logic for recipient/attorney wording.
</commit_message>
<xml_diff>
--- a/docassemble/MAEvictionDefense/data/templates/include_SignatureBlock.docx
+++ b/docassemble/MAEvictionDefense/data/templates/include_SignatureBlock.docx
@@ -1,6 +1,6 @@
 
 <file path=word/document.xml><?xml version="1.0" encoding="utf-8"?>
-<w:document xmlns:wpc="http://schemas.microsoft.com/office/word/2010/wordprocessingCanvas" xmlns:cx="http://schemas.microsoft.com/office/drawing/2014/chartex" xmlns:cx1="http://schemas.microsoft.com/office/drawing/2015/9/8/chartex" xmlns:mc="http://schemas.openxmlformats.org/markup-compatibility/2006" xmlns:o="urn:schemas-microsoft-com:office:office" xmlns:r="http://schemas.openxmlformats.org/officeDocument/2006/relationships" xmlns:m="http://schemas.openxmlformats.org/officeDocument/2006/math" xmlns:v="urn:schemas-microsoft-com:vml" xmlns:wp14="http://schemas.microsoft.com/office/word/2010/wordprocessingDrawing" xmlns:wp="http://schemas.openxmlformats.org/drawingml/2006/wordprocessingDrawing" xmlns:w10="urn:schemas-microsoft-com:office:word" xmlns:w="http://schemas.openxmlformats.org/wordprocessingml/2006/main" xmlns:w14="http://schemas.microsoft.com/office/word/2010/wordml" xmlns:w15="http://schemas.microsoft.com/office/word/2012/wordml" xmlns:w16se="http://schemas.microsoft.com/office/word/2015/wordml/symex" xmlns:wpg="http://schemas.microsoft.com/office/word/2010/wordprocessingGroup" xmlns:wpi="http://schemas.microsoft.com/office/word/2010/wordprocessingInk" xmlns:wne="http://schemas.microsoft.com/office/word/2006/wordml" xmlns:wps="http://schemas.microsoft.com/office/word/2010/wordprocessingShape" mc:Ignorable="w14 w15 w16se wp14">
+<w:document xmlns:wpc="http://schemas.microsoft.com/office/word/2010/wordprocessingCanvas" xmlns:cx="http://schemas.microsoft.com/office/drawing/2014/chartex" xmlns:cx1="http://schemas.microsoft.com/office/drawing/2015/9/8/chartex" xmlns:cx2="http://schemas.microsoft.com/office/drawing/2015/10/21/chartex" xmlns:cx3="http://schemas.microsoft.com/office/drawing/2016/5/9/chartex" xmlns:cx4="http://schemas.microsoft.com/office/drawing/2016/5/10/chartex" xmlns:cx5="http://schemas.microsoft.com/office/drawing/2016/5/11/chartex" xmlns:cx6="http://schemas.microsoft.com/office/drawing/2016/5/12/chartex" xmlns:cx7="http://schemas.microsoft.com/office/drawing/2016/5/13/chartex" xmlns:cx8="http://schemas.microsoft.com/office/drawing/2016/5/14/chartex" xmlns:mc="http://schemas.openxmlformats.org/markup-compatibility/2006" xmlns:aink="http://schemas.microsoft.com/office/drawing/2016/ink" xmlns:am3d="http://schemas.microsoft.com/office/drawing/2017/model3d" xmlns:o="urn:schemas-microsoft-com:office:office" xmlns:oel="http://schemas.microsoft.com/office/2019/extlst" xmlns:r="http://schemas.openxmlformats.org/officeDocument/2006/relationships" xmlns:m="http://schemas.openxmlformats.org/officeDocument/2006/math" xmlns:v="urn:schemas-microsoft-com:vml" xmlns:wp14="http://schemas.microsoft.com/office/word/2010/wordprocessingDrawing" xmlns:wp="http://schemas.openxmlformats.org/drawingml/2006/wordprocessingDrawing" xmlns:w10="urn:schemas-microsoft-com:office:word" xmlns:w="http://schemas.openxmlformats.org/wordprocessingml/2006/main" xmlns:w14="http://schemas.microsoft.com/office/word/2010/wordml" xmlns:w15="http://schemas.microsoft.com/office/word/2012/wordml" xmlns:w16cex="http://schemas.microsoft.com/office/word/2018/wordml/cex" xmlns:w16cid="http://schemas.microsoft.com/office/word/2016/wordml/cid" xmlns:w16="http://schemas.microsoft.com/office/word/2018/wordml" xmlns:w16sdtdh="http://schemas.microsoft.com/office/word/2020/wordml/sdtdatahash" xmlns:w16se="http://schemas.microsoft.com/office/word/2015/wordml/symex" xmlns:wpg="http://schemas.microsoft.com/office/word/2010/wordprocessingGroup" xmlns:wpi="http://schemas.microsoft.com/office/word/2010/wordprocessingInk" xmlns:wne="http://schemas.microsoft.com/office/word/2006/wordml" xmlns:wps="http://schemas.microsoft.com/office/word/2010/wordprocessingShape" mc:Ignorable="w14 w15 w16se w16cid w16 w16cex w16sdtdh wp14">
   <w:body>
     <w:p>
       <w:pPr>
@@ -20,7 +20,263 @@
           <w:sz w:val="24"/>
           <w:szCs w:val="24"/>
         </w:rPr>
-        <w:t>I hereby certify that I {{ method_of_service }} a copy of this document to the landlord or his/her lawyer on {{ service_date }}.</w:t>
+        <w:t xml:space="preserve">{%p if </w:t>
+      </w:r>
+      <w:proofErr w:type="spellStart"/>
+      <w:r>
+        <w:rPr>
+          <w:rFonts w:ascii="Times New Roman" w:eastAsia="Times New Roman" w:hAnsi="Times New Roman" w:cs="Times New Roman"/>
+          <w:sz w:val="24"/>
+          <w:szCs w:val="24"/>
+        </w:rPr>
+        <w:t>service_delivered_by</w:t>
+      </w:r>
+      <w:proofErr w:type="spellEnd"/>
+      <w:r>
+        <w:rPr>
+          <w:rFonts w:ascii="Times New Roman" w:eastAsia="Times New Roman" w:hAnsi="Times New Roman" w:cs="Times New Roman"/>
+          <w:sz w:val="24"/>
+          <w:szCs w:val="24"/>
+        </w:rPr>
+        <w:t xml:space="preserve"> == '</w:t>
+      </w:r>
+      <w:proofErr w:type="spellStart"/>
+      <w:r>
+        <w:rPr>
+          <w:rFonts w:ascii="Times New Roman" w:eastAsia="Times New Roman" w:hAnsi="Times New Roman" w:cs="Times New Roman"/>
+          <w:sz w:val="24"/>
+          <w:szCs w:val="24"/>
+        </w:rPr>
+        <w:t>gbls_staff</w:t>
+      </w:r>
+      <w:proofErr w:type="spellEnd"/>
+      <w:r>
+        <w:rPr>
+          <w:rFonts w:ascii="Times New Roman" w:eastAsia="Times New Roman" w:hAnsi="Times New Roman" w:cs="Times New Roman"/>
+          <w:sz w:val="24"/>
+          <w:szCs w:val="24"/>
+        </w:rPr>
+        <w:t xml:space="preserve">' </w:t>
+      </w:r>
+      <w:proofErr w:type="gramStart"/>
+      <w:r>
+        <w:rPr>
+          <w:rFonts w:ascii="Times New Roman" w:eastAsia="Times New Roman" w:hAnsi="Times New Roman" w:cs="Times New Roman"/>
+          <w:sz w:val="24"/>
+          <w:szCs w:val="24"/>
+        </w:rPr>
+        <w:t>%}I</w:t>
+      </w:r>
+      <w:proofErr w:type="gramEnd"/>
+      <w:r>
+        <w:rPr>
+          <w:rFonts w:ascii="Times New Roman" w:eastAsia="Times New Roman" w:hAnsi="Times New Roman" w:cs="Times New Roman"/>
+          <w:sz w:val="24"/>
+          <w:szCs w:val="24"/>
+        </w:rPr>
+        <w:t xml:space="preserve"> caused the foregoing to be served by {{ </w:t>
+      </w:r>
+      <w:proofErr w:type="spellStart"/>
+      <w:r>
+        <w:rPr>
+          <w:rFonts w:ascii="Times New Roman" w:eastAsia="Times New Roman" w:hAnsi="Times New Roman" w:cs="Times New Roman"/>
+          <w:sz w:val="24"/>
+          <w:szCs w:val="24"/>
+        </w:rPr>
+        <w:t>method_of_service</w:t>
+      </w:r>
+      <w:proofErr w:type="spellEnd"/>
+      <w:r>
+        <w:rPr>
+          <w:rFonts w:ascii="Times New Roman" w:eastAsia="Times New Roman" w:hAnsi="Times New Roman" w:cs="Times New Roman"/>
+          <w:sz w:val="24"/>
+          <w:szCs w:val="24"/>
+        </w:rPr>
+        <w:t xml:space="preserve"> }} on {{ "the landlord's attorney" if </w:t>
+      </w:r>
+      <w:proofErr w:type="spellStart"/>
+      <w:r>
+        <w:rPr>
+          <w:rFonts w:ascii="Times New Roman" w:eastAsia="Times New Roman" w:hAnsi="Times New Roman" w:cs="Times New Roman"/>
+          <w:sz w:val="24"/>
+          <w:szCs w:val="24"/>
+        </w:rPr>
+        <w:t>service_recipient</w:t>
+      </w:r>
+      <w:proofErr w:type="spellEnd"/>
+      <w:r>
+        <w:rPr>
+          <w:rFonts w:ascii="Times New Roman" w:eastAsia="Times New Roman" w:hAnsi="Times New Roman" w:cs="Times New Roman"/>
+          <w:sz w:val="24"/>
+          <w:szCs w:val="24"/>
+        </w:rPr>
+        <w:t xml:space="preserve"> == '</w:t>
+      </w:r>
+      <w:proofErr w:type="spellStart"/>
+      <w:r>
+        <w:rPr>
+          <w:rFonts w:ascii="Times New Roman" w:eastAsia="Times New Roman" w:hAnsi="Times New Roman" w:cs="Times New Roman"/>
+          <w:sz w:val="24"/>
+          <w:szCs w:val="24"/>
+        </w:rPr>
+        <w:t>landlord_attorney</w:t>
+      </w:r>
+      <w:proofErr w:type="spellEnd"/>
+      <w:r>
+        <w:rPr>
+          <w:rFonts w:ascii="Times New Roman" w:eastAsia="Times New Roman" w:hAnsi="Times New Roman" w:cs="Times New Roman"/>
+          <w:sz w:val="24"/>
+          <w:szCs w:val="24"/>
+        </w:rPr>
+        <w:t xml:space="preserve">' else "the landlord" }} on {{ </w:t>
+      </w:r>
+      <w:proofErr w:type="spellStart"/>
+      <w:r>
+        <w:rPr>
+          <w:rFonts w:ascii="Times New Roman" w:eastAsia="Times New Roman" w:hAnsi="Times New Roman" w:cs="Times New Roman"/>
+          <w:sz w:val="24"/>
+          <w:szCs w:val="24"/>
+        </w:rPr>
+        <w:t>service_date</w:t>
+      </w:r>
+      <w:proofErr w:type="spellEnd"/>
+      <w:r>
+        <w:rPr>
+          <w:rFonts w:ascii="Times New Roman" w:eastAsia="Times New Roman" w:hAnsi="Times New Roman" w:cs="Times New Roman"/>
+          <w:sz w:val="24"/>
+          <w:szCs w:val="24"/>
+        </w:rPr>
+        <w:t xml:space="preserve"> }}.</w:t>
+      </w:r>
+    </w:p>
+    <w:p>
+      <w:pPr>
+        <w:keepNext/>
+        <w:keepLines/>
+        <w:spacing w:after="0" w:line="240" w:lineRule="auto"/>
+        <w:rPr>
+          <w:rFonts w:ascii="Times New Roman" w:eastAsia="Times New Roman" w:hAnsi="Times New Roman" w:cs="Times New Roman"/>
+          <w:sz w:val="24"/>
+          <w:szCs w:val="24"/>
+        </w:rPr>
+      </w:pPr>
+      <w:r>
+        <w:rPr>
+          <w:rFonts w:ascii="Times New Roman" w:eastAsia="Times New Roman" w:hAnsi="Times New Roman" w:cs="Times New Roman"/>
+          <w:sz w:val="24"/>
+          <w:szCs w:val="24"/>
+        </w:rPr>
+        <w:t xml:space="preserve">{%p else </w:t>
+      </w:r>
+      <w:proofErr w:type="gramStart"/>
+      <w:r>
+        <w:rPr>
+          <w:rFonts w:ascii="Times New Roman" w:eastAsia="Times New Roman" w:hAnsi="Times New Roman" w:cs="Times New Roman"/>
+          <w:sz w:val="24"/>
+          <w:szCs w:val="24"/>
+        </w:rPr>
+        <w:t>%}I</w:t>
+      </w:r>
+      <w:proofErr w:type="gramEnd"/>
+      <w:r>
+        <w:rPr>
+          <w:rFonts w:ascii="Times New Roman" w:eastAsia="Times New Roman" w:hAnsi="Times New Roman" w:cs="Times New Roman"/>
+          <w:sz w:val="24"/>
+          <w:szCs w:val="24"/>
+        </w:rPr>
+        <w:t xml:space="preserve"> hereby certify that I {{ </w:t>
+      </w:r>
+      <w:proofErr w:type="spellStart"/>
+      <w:r>
+        <w:rPr>
+          <w:rFonts w:ascii="Times New Roman" w:eastAsia="Times New Roman" w:hAnsi="Times New Roman" w:cs="Times New Roman"/>
+          <w:sz w:val="24"/>
+          <w:szCs w:val="24"/>
+        </w:rPr>
+        <w:t>method_of_service</w:t>
+      </w:r>
+      <w:proofErr w:type="spellEnd"/>
+      <w:r>
+        <w:rPr>
+          <w:rFonts w:ascii="Times New Roman" w:eastAsia="Times New Roman" w:hAnsi="Times New Roman" w:cs="Times New Roman"/>
+          <w:sz w:val="24"/>
+          <w:szCs w:val="24"/>
+        </w:rPr>
+        <w:t xml:space="preserve"> }} a copy of this document to {{ "the landlord's attorney" if </w:t>
+      </w:r>
+      <w:proofErr w:type="spellStart"/>
+      <w:r>
+        <w:rPr>
+          <w:rFonts w:ascii="Times New Roman" w:eastAsia="Times New Roman" w:hAnsi="Times New Roman" w:cs="Times New Roman"/>
+          <w:sz w:val="24"/>
+          <w:szCs w:val="24"/>
+        </w:rPr>
+        <w:t>service_recipient</w:t>
+      </w:r>
+      <w:proofErr w:type="spellEnd"/>
+      <w:r>
+        <w:rPr>
+          <w:rFonts w:ascii="Times New Roman" w:eastAsia="Times New Roman" w:hAnsi="Times New Roman" w:cs="Times New Roman"/>
+          <w:sz w:val="24"/>
+          <w:szCs w:val="24"/>
+        </w:rPr>
+        <w:t xml:space="preserve"> == '</w:t>
+      </w:r>
+      <w:proofErr w:type="spellStart"/>
+      <w:r>
+        <w:rPr>
+          <w:rFonts w:ascii="Times New Roman" w:eastAsia="Times New Roman" w:hAnsi="Times New Roman" w:cs="Times New Roman"/>
+          <w:sz w:val="24"/>
+          <w:szCs w:val="24"/>
+        </w:rPr>
+        <w:t>landlord_attorney</w:t>
+      </w:r>
+      <w:proofErr w:type="spellEnd"/>
+      <w:r>
+        <w:rPr>
+          <w:rFonts w:ascii="Times New Roman" w:eastAsia="Times New Roman" w:hAnsi="Times New Roman" w:cs="Times New Roman"/>
+          <w:sz w:val="24"/>
+          <w:szCs w:val="24"/>
+        </w:rPr>
+        <w:t xml:space="preserve">' else "the landlord" }} on {{ </w:t>
+      </w:r>
+      <w:proofErr w:type="spellStart"/>
+      <w:r>
+        <w:rPr>
+          <w:rFonts w:ascii="Times New Roman" w:eastAsia="Times New Roman" w:hAnsi="Times New Roman" w:cs="Times New Roman"/>
+          <w:sz w:val="24"/>
+          <w:szCs w:val="24"/>
+        </w:rPr>
+        <w:t>service_date</w:t>
+      </w:r>
+      <w:proofErr w:type="spellEnd"/>
+      <w:r>
+        <w:rPr>
+          <w:rFonts w:ascii="Times New Roman" w:eastAsia="Times New Roman" w:hAnsi="Times New Roman" w:cs="Times New Roman"/>
+          <w:sz w:val="24"/>
+          <w:szCs w:val="24"/>
+        </w:rPr>
+        <w:t xml:space="preserve"> }}.</w:t>
+      </w:r>
+    </w:p>
+    <w:p>
+      <w:pPr>
+        <w:keepNext/>
+        <w:keepLines/>
+        <w:spacing w:after="0" w:line="240" w:lineRule="auto"/>
+        <w:rPr>
+          <w:rFonts w:ascii="Times New Roman" w:eastAsia="Times New Roman" w:hAnsi="Times New Roman" w:cs="Times New Roman"/>
+          <w:sz w:val="24"/>
+          <w:szCs w:val="24"/>
+        </w:rPr>
+      </w:pPr>
+      <w:r>
+        <w:rPr>
+          <w:rFonts w:ascii="Times New Roman" w:eastAsia="Times New Roman" w:hAnsi="Times New Roman" w:cs="Times New Roman"/>
+          <w:sz w:val="24"/>
+          <w:szCs w:val="24"/>
+        </w:rPr>
+        <w:t>{%p endif %}</w:t>
       </w:r>
     </w:p>
     <w:p>
@@ -79,6 +335,7 @@
           <w:szCs w:val="24"/>
         </w:rPr>
       </w:pPr>
+      <w:proofErr w:type="gramStart"/>
       <w:r>
         <w:rPr>
           <w:rFonts w:ascii="Times New Roman" w:eastAsia="Times New Roman" w:hAnsi="Times New Roman" w:cs="Times New Roman"/>
@@ -95,6 +352,7 @@
         </w:rPr>
         <w:t>tenant</w:t>
       </w:r>
+      <w:proofErr w:type="gramEnd"/>
       <w:r>
         <w:rPr>
           <w:rFonts w:ascii="Times New Roman" w:eastAsia="Times New Roman" w:hAnsi="Times New Roman" w:cs="Times New Roman"/>
@@ -146,15 +404,69 @@
           <w:sz w:val="24"/>
           <w:szCs w:val="24"/>
         </w:rPr>
-        <w:t>if person_answering == 'attorney' and representatio</w:t>
-      </w:r>
-      <w:r>
-        <w:rPr>
-          <w:rFonts w:ascii="Times New Roman" w:eastAsia="Times New Roman" w:hAnsi="Times New Roman" w:cs="Times New Roman"/>
-          <w:sz w:val="24"/>
-          <w:szCs w:val="24"/>
-        </w:rPr>
-        <w:t>n_type == 'entering_appearance' %}</w:t>
+        <w:t xml:space="preserve">if </w:t>
+      </w:r>
+      <w:proofErr w:type="spellStart"/>
+      <w:r>
+        <w:rPr>
+          <w:rFonts w:ascii="Times New Roman" w:eastAsia="Times New Roman" w:hAnsi="Times New Roman" w:cs="Times New Roman"/>
+          <w:sz w:val="24"/>
+          <w:szCs w:val="24"/>
+        </w:rPr>
+        <w:t>person_answering</w:t>
+      </w:r>
+      <w:proofErr w:type="spellEnd"/>
+      <w:r>
+        <w:rPr>
+          <w:rFonts w:ascii="Times New Roman" w:eastAsia="Times New Roman" w:hAnsi="Times New Roman" w:cs="Times New Roman"/>
+          <w:sz w:val="24"/>
+          <w:szCs w:val="24"/>
+        </w:rPr>
+        <w:t xml:space="preserve"> == 'attorney' and </w:t>
+      </w:r>
+      <w:proofErr w:type="spellStart"/>
+      <w:r>
+        <w:rPr>
+          <w:rFonts w:ascii="Times New Roman" w:eastAsia="Times New Roman" w:hAnsi="Times New Roman" w:cs="Times New Roman"/>
+          <w:sz w:val="24"/>
+          <w:szCs w:val="24"/>
+        </w:rPr>
+        <w:t>representatio</w:t>
+      </w:r>
+      <w:r>
+        <w:rPr>
+          <w:rFonts w:ascii="Times New Roman" w:eastAsia="Times New Roman" w:hAnsi="Times New Roman" w:cs="Times New Roman"/>
+          <w:sz w:val="24"/>
+          <w:szCs w:val="24"/>
+        </w:rPr>
+        <w:t>n_type</w:t>
+      </w:r>
+      <w:proofErr w:type="spellEnd"/>
+      <w:r>
+        <w:rPr>
+          <w:rFonts w:ascii="Times New Roman" w:eastAsia="Times New Roman" w:hAnsi="Times New Roman" w:cs="Times New Roman"/>
+          <w:sz w:val="24"/>
+          <w:szCs w:val="24"/>
+        </w:rPr>
+        <w:t xml:space="preserve"> == '</w:t>
+      </w:r>
+      <w:proofErr w:type="spellStart"/>
+      <w:r>
+        <w:rPr>
+          <w:rFonts w:ascii="Times New Roman" w:eastAsia="Times New Roman" w:hAnsi="Times New Roman" w:cs="Times New Roman"/>
+          <w:sz w:val="24"/>
+          <w:szCs w:val="24"/>
+        </w:rPr>
+        <w:t>entering_appearance</w:t>
+      </w:r>
+      <w:proofErr w:type="spellEnd"/>
+      <w:r>
+        <w:rPr>
+          <w:rFonts w:ascii="Times New Roman" w:eastAsia="Times New Roman" w:hAnsi="Times New Roman" w:cs="Times New Roman"/>
+          <w:sz w:val="24"/>
+          <w:szCs w:val="24"/>
+        </w:rPr>
+        <w:t>' %}</w:t>
       </w:r>
     </w:p>
     <w:p>
@@ -191,15 +503,43 @@
           <w:sz w:val="24"/>
           <w:szCs w:val="24"/>
         </w:rPr>
-        <w:t>{%p if additional_tenants.</w:t>
-      </w:r>
-      <w:r>
-        <w:rPr>
-          <w:rFonts w:ascii="Times New Roman" w:eastAsia="Times New Roman" w:hAnsi="Times New Roman" w:cs="Times New Roman"/>
-          <w:sz w:val="24"/>
-          <w:szCs w:val="24"/>
-        </w:rPr>
-        <w:t>number()</w:t>
+        <w:t xml:space="preserve">{%p if </w:t>
+      </w:r>
+      <w:proofErr w:type="spellStart"/>
+      <w:r>
+        <w:rPr>
+          <w:rFonts w:ascii="Times New Roman" w:eastAsia="Times New Roman" w:hAnsi="Times New Roman" w:cs="Times New Roman"/>
+          <w:sz w:val="24"/>
+          <w:szCs w:val="24"/>
+        </w:rPr>
+        <w:t>additional_</w:t>
+      </w:r>
+      <w:proofErr w:type="gramStart"/>
+      <w:r>
+        <w:rPr>
+          <w:rFonts w:ascii="Times New Roman" w:eastAsia="Times New Roman" w:hAnsi="Times New Roman" w:cs="Times New Roman"/>
+          <w:sz w:val="24"/>
+          <w:szCs w:val="24"/>
+        </w:rPr>
+        <w:t>tenants.</w:t>
+      </w:r>
+      <w:r>
+        <w:rPr>
+          <w:rFonts w:ascii="Times New Roman" w:eastAsia="Times New Roman" w:hAnsi="Times New Roman" w:cs="Times New Roman"/>
+          <w:sz w:val="24"/>
+          <w:szCs w:val="24"/>
+        </w:rPr>
+        <w:t>number</w:t>
+      </w:r>
+      <w:proofErr w:type="spellEnd"/>
+      <w:proofErr w:type="gramEnd"/>
+      <w:r>
+        <w:rPr>
+          <w:rFonts w:ascii="Times New Roman" w:eastAsia="Times New Roman" w:hAnsi="Times New Roman" w:cs="Times New Roman"/>
+          <w:sz w:val="24"/>
+          <w:szCs w:val="24"/>
+        </w:rPr>
+        <w:t>()</w:t>
       </w:r>
       <w:r>
         <w:rPr>
@@ -244,7 +584,43 @@
           <w:sz w:val="24"/>
           <w:szCs w:val="24"/>
         </w:rPr>
-        <w:t>AND {{ additional_tenants }}</w:t>
+        <w:t xml:space="preserve">AND </w:t>
+      </w:r>
+      <w:proofErr w:type="gramStart"/>
+      <w:r>
+        <w:rPr>
+          <w:rFonts w:ascii="Times New Roman" w:eastAsia="Times New Roman" w:hAnsi="Times New Roman" w:cs="Times New Roman"/>
+          <w:sz w:val="24"/>
+          <w:szCs w:val="24"/>
+        </w:rPr>
+        <w:t xml:space="preserve">{{ </w:t>
+      </w:r>
+      <w:proofErr w:type="spellStart"/>
+      <w:r>
+        <w:rPr>
+          <w:rFonts w:ascii="Times New Roman" w:eastAsia="Times New Roman" w:hAnsi="Times New Roman" w:cs="Times New Roman"/>
+          <w:sz w:val="24"/>
+          <w:szCs w:val="24"/>
+        </w:rPr>
+        <w:t>additional</w:t>
+      </w:r>
+      <w:proofErr w:type="gramEnd"/>
+      <w:r>
+        <w:rPr>
+          <w:rFonts w:ascii="Times New Roman" w:eastAsia="Times New Roman" w:hAnsi="Times New Roman" w:cs="Times New Roman"/>
+          <w:sz w:val="24"/>
+          <w:szCs w:val="24"/>
+        </w:rPr>
+        <w:t>_tenants</w:t>
+      </w:r>
+      <w:proofErr w:type="spellEnd"/>
+      <w:r>
+        <w:rPr>
+          <w:rFonts w:ascii="Times New Roman" w:eastAsia="Times New Roman" w:hAnsi="Times New Roman" w:cs="Times New Roman"/>
+          <w:sz w:val="24"/>
+          <w:szCs w:val="24"/>
+        </w:rPr>
+        <w:t xml:space="preserve"> }}</w:t>
       </w:r>
     </w:p>
     <w:p>
@@ -407,13 +783,41 @@
           <w:szCs w:val="24"/>
         </w:rPr>
       </w:pPr>
-      <w:r>
-        <w:rPr>
-          <w:rFonts w:ascii="Times New Roman" w:eastAsia="Times New Roman" w:hAnsi="Times New Roman" w:cs="Times New Roman"/>
-          <w:sz w:val="24"/>
-          <w:szCs w:val="24"/>
-        </w:rPr>
-        <w:t>{{ tenants_attorney.signature }}</w:t>
+      <w:proofErr w:type="gramStart"/>
+      <w:r>
+        <w:rPr>
+          <w:rFonts w:ascii="Times New Roman" w:eastAsia="Times New Roman" w:hAnsi="Times New Roman" w:cs="Times New Roman"/>
+          <w:sz w:val="24"/>
+          <w:szCs w:val="24"/>
+        </w:rPr>
+        <w:t xml:space="preserve">{{ </w:t>
+      </w:r>
+      <w:proofErr w:type="spellStart"/>
+      <w:r>
+        <w:rPr>
+          <w:rFonts w:ascii="Times New Roman" w:eastAsia="Times New Roman" w:hAnsi="Times New Roman" w:cs="Times New Roman"/>
+          <w:sz w:val="24"/>
+          <w:szCs w:val="24"/>
+        </w:rPr>
+        <w:t>tenants</w:t>
+      </w:r>
+      <w:proofErr w:type="gramEnd"/>
+      <w:r>
+        <w:rPr>
+          <w:rFonts w:ascii="Times New Roman" w:eastAsia="Times New Roman" w:hAnsi="Times New Roman" w:cs="Times New Roman"/>
+          <w:sz w:val="24"/>
+          <w:szCs w:val="24"/>
+        </w:rPr>
+        <w:t>_attorney.signature</w:t>
+      </w:r>
+      <w:proofErr w:type="spellEnd"/>
+      <w:r>
+        <w:rPr>
+          <w:rFonts w:ascii="Times New Roman" w:eastAsia="Times New Roman" w:hAnsi="Times New Roman" w:cs="Times New Roman"/>
+          <w:sz w:val="24"/>
+          <w:szCs w:val="24"/>
+        </w:rPr>
+        <w:t xml:space="preserve"> }}</w:t>
       </w:r>
     </w:p>
     <w:p>
@@ -473,13 +877,41 @@
           <w:szCs w:val="24"/>
         </w:rPr>
       </w:pPr>
-      <w:r>
-        <w:rPr>
-          <w:rFonts w:ascii="Times New Roman" w:eastAsia="Times New Roman" w:hAnsi="Times New Roman" w:cs="Times New Roman"/>
-          <w:sz w:val="24"/>
-          <w:szCs w:val="24"/>
-        </w:rPr>
-        <w:t>{{ tenants_attorney.name.full() }} {# don't use initials unless attorney wrote it that way #}</w:t>
+      <w:proofErr w:type="gramStart"/>
+      <w:r>
+        <w:rPr>
+          <w:rFonts w:ascii="Times New Roman" w:eastAsia="Times New Roman" w:hAnsi="Times New Roman" w:cs="Times New Roman"/>
+          <w:sz w:val="24"/>
+          <w:szCs w:val="24"/>
+        </w:rPr>
+        <w:t xml:space="preserve">{{ </w:t>
+      </w:r>
+      <w:proofErr w:type="spellStart"/>
+      <w:r>
+        <w:rPr>
+          <w:rFonts w:ascii="Times New Roman" w:eastAsia="Times New Roman" w:hAnsi="Times New Roman" w:cs="Times New Roman"/>
+          <w:sz w:val="24"/>
+          <w:szCs w:val="24"/>
+        </w:rPr>
+        <w:t>tenants_attorney.name</w:t>
+      </w:r>
+      <w:proofErr w:type="gramEnd"/>
+      <w:r>
+        <w:rPr>
+          <w:rFonts w:ascii="Times New Roman" w:eastAsia="Times New Roman" w:hAnsi="Times New Roman" w:cs="Times New Roman"/>
+          <w:sz w:val="24"/>
+          <w:szCs w:val="24"/>
+        </w:rPr>
+        <w:t>.full</w:t>
+      </w:r>
+      <w:proofErr w:type="spellEnd"/>
+      <w:r>
+        <w:rPr>
+          <w:rFonts w:ascii="Times New Roman" w:eastAsia="Times New Roman" w:hAnsi="Times New Roman" w:cs="Times New Roman"/>
+          <w:sz w:val="24"/>
+          <w:szCs w:val="24"/>
+        </w:rPr>
+        <w:t>() }} {# don't use initials unless attorney wrote it that way #}</w:t>
       </w:r>
     </w:p>
     <w:p>
@@ -516,7 +948,35 @@
           <w:sz w:val="24"/>
           <w:szCs w:val="24"/>
         </w:rPr>
-        <w:t>BBO # {{ tenants_attorney.bbo }}</w:t>
+        <w:t xml:space="preserve">BBO # </w:t>
+      </w:r>
+      <w:proofErr w:type="gramStart"/>
+      <w:r>
+        <w:rPr>
+          <w:rFonts w:ascii="Times New Roman" w:eastAsia="Times New Roman" w:hAnsi="Times New Roman" w:cs="Times New Roman"/>
+          <w:sz w:val="24"/>
+          <w:szCs w:val="24"/>
+        </w:rPr>
+        <w:t xml:space="preserve">{{ </w:t>
+      </w:r>
+      <w:proofErr w:type="spellStart"/>
+      <w:r>
+        <w:rPr>
+          <w:rFonts w:ascii="Times New Roman" w:eastAsia="Times New Roman" w:hAnsi="Times New Roman" w:cs="Times New Roman"/>
+          <w:sz w:val="24"/>
+          <w:szCs w:val="24"/>
+        </w:rPr>
+        <w:t>tenants_attorney.bbo</w:t>
+      </w:r>
+      <w:proofErr w:type="spellEnd"/>
+      <w:proofErr w:type="gramEnd"/>
+      <w:r>
+        <w:rPr>
+          <w:rFonts w:ascii="Times New Roman" w:eastAsia="Times New Roman" w:hAnsi="Times New Roman" w:cs="Times New Roman"/>
+          <w:sz w:val="24"/>
+          <w:szCs w:val="24"/>
+        </w:rPr>
+        <w:t xml:space="preserve"> }}</w:t>
       </w:r>
     </w:p>
     <w:p>
@@ -547,13 +1007,41 @@
           <w:szCs w:val="24"/>
         </w:rPr>
       </w:pPr>
-      <w:r>
-        <w:rPr>
-          <w:rFonts w:ascii="Times New Roman" w:eastAsia="Times New Roman" w:hAnsi="Times New Roman" w:cs="Times New Roman"/>
-          <w:sz w:val="24"/>
-          <w:szCs w:val="24"/>
-        </w:rPr>
-        <w:t>{{ tenants_attorney.office }}</w:t>
+      <w:proofErr w:type="gramStart"/>
+      <w:r>
+        <w:rPr>
+          <w:rFonts w:ascii="Times New Roman" w:eastAsia="Times New Roman" w:hAnsi="Times New Roman" w:cs="Times New Roman"/>
+          <w:sz w:val="24"/>
+          <w:szCs w:val="24"/>
+        </w:rPr>
+        <w:t xml:space="preserve">{{ </w:t>
+      </w:r>
+      <w:proofErr w:type="spellStart"/>
+      <w:r>
+        <w:rPr>
+          <w:rFonts w:ascii="Times New Roman" w:eastAsia="Times New Roman" w:hAnsi="Times New Roman" w:cs="Times New Roman"/>
+          <w:sz w:val="24"/>
+          <w:szCs w:val="24"/>
+        </w:rPr>
+        <w:t>tenants</w:t>
+      </w:r>
+      <w:proofErr w:type="gramEnd"/>
+      <w:r>
+        <w:rPr>
+          <w:rFonts w:ascii="Times New Roman" w:eastAsia="Times New Roman" w:hAnsi="Times New Roman" w:cs="Times New Roman"/>
+          <w:sz w:val="24"/>
+          <w:szCs w:val="24"/>
+        </w:rPr>
+        <w:t>_attorney.office</w:t>
+      </w:r>
+      <w:proofErr w:type="spellEnd"/>
+      <w:r>
+        <w:rPr>
+          <w:rFonts w:ascii="Times New Roman" w:eastAsia="Times New Roman" w:hAnsi="Times New Roman" w:cs="Times New Roman"/>
+          <w:sz w:val="24"/>
+          <w:szCs w:val="24"/>
+        </w:rPr>
+        <w:t xml:space="preserve"> }}</w:t>
       </w:r>
     </w:p>
     <w:p>
@@ -584,13 +1072,41 @@
           <w:szCs w:val="24"/>
         </w:rPr>
       </w:pPr>
-      <w:r>
-        <w:rPr>
-          <w:rFonts w:ascii="Times New Roman" w:eastAsia="Times New Roman" w:hAnsi="Times New Roman" w:cs="Times New Roman"/>
-          <w:sz w:val="24"/>
-          <w:szCs w:val="24"/>
-        </w:rPr>
-        <w:t>{{ tenants_attorney.address.block() }}</w:t>
+      <w:proofErr w:type="gramStart"/>
+      <w:r>
+        <w:rPr>
+          <w:rFonts w:ascii="Times New Roman" w:eastAsia="Times New Roman" w:hAnsi="Times New Roman" w:cs="Times New Roman"/>
+          <w:sz w:val="24"/>
+          <w:szCs w:val="24"/>
+        </w:rPr>
+        <w:t xml:space="preserve">{{ </w:t>
+      </w:r>
+      <w:proofErr w:type="spellStart"/>
+      <w:r>
+        <w:rPr>
+          <w:rFonts w:ascii="Times New Roman" w:eastAsia="Times New Roman" w:hAnsi="Times New Roman" w:cs="Times New Roman"/>
+          <w:sz w:val="24"/>
+          <w:szCs w:val="24"/>
+        </w:rPr>
+        <w:t>tenants</w:t>
+      </w:r>
+      <w:proofErr w:type="gramEnd"/>
+      <w:r>
+        <w:rPr>
+          <w:rFonts w:ascii="Times New Roman" w:eastAsia="Times New Roman" w:hAnsi="Times New Roman" w:cs="Times New Roman"/>
+          <w:sz w:val="24"/>
+          <w:szCs w:val="24"/>
+        </w:rPr>
+        <w:t>_attorney.address.block</w:t>
+      </w:r>
+      <w:proofErr w:type="spellEnd"/>
+      <w:r>
+        <w:rPr>
+          <w:rFonts w:ascii="Times New Roman" w:eastAsia="Times New Roman" w:hAnsi="Times New Roman" w:cs="Times New Roman"/>
+          <w:sz w:val="24"/>
+          <w:szCs w:val="24"/>
+        </w:rPr>
+        <w:t>() }}</w:t>
       </w:r>
     </w:p>
     <w:p>
@@ -621,13 +1137,41 @@
           <w:szCs w:val="24"/>
         </w:rPr>
       </w:pPr>
-      <w:r>
-        <w:rPr>
-          <w:rFonts w:ascii="Times New Roman" w:eastAsia="Times New Roman" w:hAnsi="Times New Roman" w:cs="Times New Roman"/>
-          <w:sz w:val="24"/>
-          <w:szCs w:val="24"/>
-        </w:rPr>
-        <w:t>{{ tenants_attorney.email }}</w:t>
+      <w:proofErr w:type="gramStart"/>
+      <w:r>
+        <w:rPr>
+          <w:rFonts w:ascii="Times New Roman" w:eastAsia="Times New Roman" w:hAnsi="Times New Roman" w:cs="Times New Roman"/>
+          <w:sz w:val="24"/>
+          <w:szCs w:val="24"/>
+        </w:rPr>
+        <w:t xml:space="preserve">{{ </w:t>
+      </w:r>
+      <w:proofErr w:type="spellStart"/>
+      <w:r>
+        <w:rPr>
+          <w:rFonts w:ascii="Times New Roman" w:eastAsia="Times New Roman" w:hAnsi="Times New Roman" w:cs="Times New Roman"/>
+          <w:sz w:val="24"/>
+          <w:szCs w:val="24"/>
+        </w:rPr>
+        <w:t>tenants</w:t>
+      </w:r>
+      <w:proofErr w:type="gramEnd"/>
+      <w:r>
+        <w:rPr>
+          <w:rFonts w:ascii="Times New Roman" w:eastAsia="Times New Roman" w:hAnsi="Times New Roman" w:cs="Times New Roman"/>
+          <w:sz w:val="24"/>
+          <w:szCs w:val="24"/>
+        </w:rPr>
+        <w:t>_attorney.email</w:t>
+      </w:r>
+      <w:proofErr w:type="spellEnd"/>
+      <w:r>
+        <w:rPr>
+          <w:rFonts w:ascii="Times New Roman" w:eastAsia="Times New Roman" w:hAnsi="Times New Roman" w:cs="Times New Roman"/>
+          <w:sz w:val="24"/>
+          <w:szCs w:val="24"/>
+        </w:rPr>
+        <w:t xml:space="preserve"> }}</w:t>
       </w:r>
     </w:p>
     <w:p>
@@ -664,7 +1208,43 @@
           <w:sz w:val="24"/>
           <w:szCs w:val="24"/>
         </w:rPr>
-        <w:t>Phone: {{ tenants_attorney.phone_number }}</w:t>
+        <w:t xml:space="preserve">Phone: </w:t>
+      </w:r>
+      <w:proofErr w:type="gramStart"/>
+      <w:r>
+        <w:rPr>
+          <w:rFonts w:ascii="Times New Roman" w:eastAsia="Times New Roman" w:hAnsi="Times New Roman" w:cs="Times New Roman"/>
+          <w:sz w:val="24"/>
+          <w:szCs w:val="24"/>
+        </w:rPr>
+        <w:t xml:space="preserve">{{ </w:t>
+      </w:r>
+      <w:proofErr w:type="spellStart"/>
+      <w:r>
+        <w:rPr>
+          <w:rFonts w:ascii="Times New Roman" w:eastAsia="Times New Roman" w:hAnsi="Times New Roman" w:cs="Times New Roman"/>
+          <w:sz w:val="24"/>
+          <w:szCs w:val="24"/>
+        </w:rPr>
+        <w:t>tenants</w:t>
+      </w:r>
+      <w:proofErr w:type="gramEnd"/>
+      <w:r>
+        <w:rPr>
+          <w:rFonts w:ascii="Times New Roman" w:eastAsia="Times New Roman" w:hAnsi="Times New Roman" w:cs="Times New Roman"/>
+          <w:sz w:val="24"/>
+          <w:szCs w:val="24"/>
+        </w:rPr>
+        <w:t>_attorney.phone_number</w:t>
+      </w:r>
+      <w:proofErr w:type="spellEnd"/>
+      <w:r>
+        <w:rPr>
+          <w:rFonts w:ascii="Times New Roman" w:eastAsia="Times New Roman" w:hAnsi="Times New Roman" w:cs="Times New Roman"/>
+          <w:sz w:val="24"/>
+          <w:szCs w:val="24"/>
+        </w:rPr>
+        <w:t xml:space="preserve"> }}</w:t>
       </w:r>
     </w:p>
     <w:p>
@@ -701,7 +1281,43 @@
           <w:sz w:val="24"/>
           <w:szCs w:val="24"/>
         </w:rPr>
-        <w:t>Fax: {{ tenants_attorney.fax_number }}</w:t>
+        <w:t xml:space="preserve">Fax: </w:t>
+      </w:r>
+      <w:proofErr w:type="gramStart"/>
+      <w:r>
+        <w:rPr>
+          <w:rFonts w:ascii="Times New Roman" w:eastAsia="Times New Roman" w:hAnsi="Times New Roman" w:cs="Times New Roman"/>
+          <w:sz w:val="24"/>
+          <w:szCs w:val="24"/>
+        </w:rPr>
+        <w:t xml:space="preserve">{{ </w:t>
+      </w:r>
+      <w:proofErr w:type="spellStart"/>
+      <w:r>
+        <w:rPr>
+          <w:rFonts w:ascii="Times New Roman" w:eastAsia="Times New Roman" w:hAnsi="Times New Roman" w:cs="Times New Roman"/>
+          <w:sz w:val="24"/>
+          <w:szCs w:val="24"/>
+        </w:rPr>
+        <w:t>tenants_attorney.fax</w:t>
+      </w:r>
+      <w:proofErr w:type="gramEnd"/>
+      <w:r>
+        <w:rPr>
+          <w:rFonts w:ascii="Times New Roman" w:eastAsia="Times New Roman" w:hAnsi="Times New Roman" w:cs="Times New Roman"/>
+          <w:sz w:val="24"/>
+          <w:szCs w:val="24"/>
+        </w:rPr>
+        <w:t>_number</w:t>
+      </w:r>
+      <w:proofErr w:type="spellEnd"/>
+      <w:r>
+        <w:rPr>
+          <w:rFonts w:ascii="Times New Roman" w:eastAsia="Times New Roman" w:hAnsi="Times New Roman" w:cs="Times New Roman"/>
+          <w:sz w:val="24"/>
+          <w:szCs w:val="24"/>
+        </w:rPr>
+        <w:t xml:space="preserve"> }}</w:t>
       </w:r>
     </w:p>
     <w:p>
@@ -831,7 +1447,25 @@
           <w:sz w:val="24"/>
           <w:szCs w:val="24"/>
         </w:rPr>
-        <w:t xml:space="preserve">defined('signature_choice') </w:t>
+        <w:t>defined('</w:t>
+      </w:r>
+      <w:proofErr w:type="spellStart"/>
+      <w:r>
+        <w:rPr>
+          <w:rFonts w:ascii="Times New Roman" w:eastAsia="Times New Roman" w:hAnsi="Times New Roman" w:cs="Times New Roman"/>
+          <w:sz w:val="24"/>
+          <w:szCs w:val="24"/>
+        </w:rPr>
+        <w:t>signature_choice</w:t>
+      </w:r>
+      <w:proofErr w:type="spellEnd"/>
+      <w:r>
+        <w:rPr>
+          <w:rFonts w:ascii="Times New Roman" w:eastAsia="Times New Roman" w:hAnsi="Times New Roman" w:cs="Times New Roman"/>
+          <w:sz w:val="24"/>
+          <w:szCs w:val="24"/>
+        </w:rPr>
+        <w:t xml:space="preserve">') </w:t>
       </w:r>
       <w:r>
         <w:rPr>
@@ -849,21 +1483,49 @@
         </w:rPr>
         <w:t xml:space="preserve"> </w:t>
       </w:r>
-      <w:r>
-        <w:rPr>
-          <w:rFonts w:ascii="Times New Roman" w:eastAsia="Times New Roman" w:hAnsi="Times New Roman" w:cs="Times New Roman"/>
-          <w:sz w:val="24"/>
-          <w:szCs w:val="24"/>
-        </w:rPr>
-        <w:t xml:space="preserve">signature_choice in </w:t>
-      </w:r>
-      <w:r>
-        <w:rPr>
-          <w:rFonts w:ascii="Times New Roman" w:eastAsia="Times New Roman" w:hAnsi="Times New Roman" w:cs="Times New Roman"/>
-          <w:sz w:val="24"/>
-          <w:szCs w:val="24"/>
-        </w:rPr>
-        <w:t>['this device','phone']</w:t>
+      <w:proofErr w:type="spellStart"/>
+      <w:r>
+        <w:rPr>
+          <w:rFonts w:ascii="Times New Roman" w:eastAsia="Times New Roman" w:hAnsi="Times New Roman" w:cs="Times New Roman"/>
+          <w:sz w:val="24"/>
+          <w:szCs w:val="24"/>
+        </w:rPr>
+        <w:t>signature_choice</w:t>
+      </w:r>
+      <w:proofErr w:type="spellEnd"/>
+      <w:r>
+        <w:rPr>
+          <w:rFonts w:ascii="Times New Roman" w:eastAsia="Times New Roman" w:hAnsi="Times New Roman" w:cs="Times New Roman"/>
+          <w:sz w:val="24"/>
+          <w:szCs w:val="24"/>
+        </w:rPr>
+        <w:t xml:space="preserve"> in </w:t>
+      </w:r>
+      <w:r>
+        <w:rPr>
+          <w:rFonts w:ascii="Times New Roman" w:eastAsia="Times New Roman" w:hAnsi="Times New Roman" w:cs="Times New Roman"/>
+          <w:sz w:val="24"/>
+          <w:szCs w:val="24"/>
+        </w:rPr>
+        <w:t xml:space="preserve">['this </w:t>
+      </w:r>
+      <w:proofErr w:type="spellStart"/>
+      <w:r>
+        <w:rPr>
+          <w:rFonts w:ascii="Times New Roman" w:eastAsia="Times New Roman" w:hAnsi="Times New Roman" w:cs="Times New Roman"/>
+          <w:sz w:val="24"/>
+          <w:szCs w:val="24"/>
+        </w:rPr>
+        <w:t>device','phone</w:t>
+      </w:r>
+      <w:proofErr w:type="spellEnd"/>
+      <w:r>
+        <w:rPr>
+          <w:rFonts w:ascii="Times New Roman" w:eastAsia="Times New Roman" w:hAnsi="Times New Roman" w:cs="Times New Roman"/>
+          <w:sz w:val="24"/>
+          <w:szCs w:val="24"/>
+        </w:rPr>
+        <w:t>']</w:t>
       </w:r>
       <w:r>
         <w:rPr>
@@ -902,6 +1564,7 @@
           <w:szCs w:val="24"/>
         </w:rPr>
       </w:pPr>
+      <w:proofErr w:type="gramStart"/>
       <w:r>
         <w:rPr>
           <w:rFonts w:ascii="Times New Roman" w:eastAsia="Times New Roman" w:hAnsi="Times New Roman" w:cs="Times New Roman"/>
@@ -910,6 +1573,7 @@
         </w:rPr>
         <w:t xml:space="preserve">{{ </w:t>
       </w:r>
+      <w:proofErr w:type="spellStart"/>
       <w:r>
         <w:rPr>
           <w:rFonts w:ascii="Times New Roman" w:eastAsia="Times New Roman" w:hAnsi="Times New Roman" w:cs="Times New Roman"/>
@@ -918,13 +1582,23 @@
         </w:rPr>
         <w:t>tenant</w:t>
       </w:r>
-      <w:r>
-        <w:rPr>
-          <w:rFonts w:ascii="Times New Roman" w:eastAsia="Times New Roman" w:hAnsi="Times New Roman" w:cs="Times New Roman"/>
-          <w:sz w:val="24"/>
-          <w:szCs w:val="24"/>
-        </w:rPr>
-        <w:t>.signature }}</w:t>
+      <w:proofErr w:type="gramEnd"/>
+      <w:r>
+        <w:rPr>
+          <w:rFonts w:ascii="Times New Roman" w:eastAsia="Times New Roman" w:hAnsi="Times New Roman" w:cs="Times New Roman"/>
+          <w:sz w:val="24"/>
+          <w:szCs w:val="24"/>
+        </w:rPr>
+        <w:t>.signature</w:t>
+      </w:r>
+      <w:proofErr w:type="spellEnd"/>
+      <w:r>
+        <w:rPr>
+          <w:rFonts w:ascii="Times New Roman" w:eastAsia="Times New Roman" w:hAnsi="Times New Roman" w:cs="Times New Roman"/>
+          <w:sz w:val="24"/>
+          <w:szCs w:val="24"/>
+        </w:rPr>
+        <w:t xml:space="preserve"> }}</w:t>
       </w:r>
     </w:p>
     <w:p>
@@ -1210,6 +1884,7 @@
           <w:szCs w:val="24"/>
         </w:rPr>
       </w:pPr>
+      <w:proofErr w:type="gramStart"/>
       <w:r>
         <w:rPr>
           <w:rFonts w:ascii="Times New Roman" w:eastAsia="Times New Roman" w:hAnsi="Times New Roman" w:cs="Times New Roman"/>
@@ -1218,13 +1893,32 @@
         </w:rPr>
         <w:t xml:space="preserve">{{ </w:t>
       </w:r>
-      <w:r>
-        <w:rPr>
-          <w:rFonts w:ascii="Times New Roman" w:eastAsia="Times New Roman" w:hAnsi="Times New Roman" w:cs="Times New Roman"/>
-          <w:sz w:val="24"/>
-          <w:szCs w:val="24"/>
-        </w:rPr>
-        <w:t>tenant.address_block()</w:t>
+      <w:proofErr w:type="spellStart"/>
+      <w:r>
+        <w:rPr>
+          <w:rFonts w:ascii="Times New Roman" w:eastAsia="Times New Roman" w:hAnsi="Times New Roman" w:cs="Times New Roman"/>
+          <w:sz w:val="24"/>
+          <w:szCs w:val="24"/>
+        </w:rPr>
+        <w:t>tenant</w:t>
+      </w:r>
+      <w:proofErr w:type="gramEnd"/>
+      <w:r>
+        <w:rPr>
+          <w:rFonts w:ascii="Times New Roman" w:eastAsia="Times New Roman" w:hAnsi="Times New Roman" w:cs="Times New Roman"/>
+          <w:sz w:val="24"/>
+          <w:szCs w:val="24"/>
+        </w:rPr>
+        <w:t>.address_block</w:t>
+      </w:r>
+      <w:proofErr w:type="spellEnd"/>
+      <w:r>
+        <w:rPr>
+          <w:rFonts w:ascii="Times New Roman" w:eastAsia="Times New Roman" w:hAnsi="Times New Roman" w:cs="Times New Roman"/>
+          <w:sz w:val="24"/>
+          <w:szCs w:val="24"/>
+        </w:rPr>
+        <w:t>()</w:t>
       </w:r>
       <w:r>
         <w:rPr>
@@ -1234,8 +1928,6 @@
         </w:rPr>
         <w:t xml:space="preserve"> }}</w:t>
       </w:r>
-      <w:bookmarkStart w:id="1" w:name="_GoBack"/>
-      <w:bookmarkEnd w:id="1"/>
     </w:p>
     <w:p>
       <w:pPr>
@@ -1271,7 +1963,53 @@
           <w:sz w:val="24"/>
           <w:szCs w:val="24"/>
         </w:rPr>
-        <w:t>{{showifdef('tenant.phone_number'</w:t>
+        <w:t>{{</w:t>
+      </w:r>
+      <w:proofErr w:type="spellStart"/>
+      <w:r>
+        <w:rPr>
+          <w:rFonts w:ascii="Times New Roman" w:eastAsia="Times New Roman" w:hAnsi="Times New Roman" w:cs="Times New Roman"/>
+          <w:sz w:val="24"/>
+          <w:szCs w:val="24"/>
+        </w:rPr>
+        <w:t>showifdef</w:t>
+      </w:r>
+      <w:proofErr w:type="spellEnd"/>
+      <w:r>
+        <w:rPr>
+          <w:rFonts w:ascii="Times New Roman" w:eastAsia="Times New Roman" w:hAnsi="Times New Roman" w:cs="Times New Roman"/>
+          <w:sz w:val="24"/>
+          <w:szCs w:val="24"/>
+        </w:rPr>
+        <w:t>('</w:t>
+      </w:r>
+      <w:proofErr w:type="spellStart"/>
+      <w:proofErr w:type="gramStart"/>
+      <w:r>
+        <w:rPr>
+          <w:rFonts w:ascii="Times New Roman" w:eastAsia="Times New Roman" w:hAnsi="Times New Roman" w:cs="Times New Roman"/>
+          <w:sz w:val="24"/>
+          <w:szCs w:val="24"/>
+        </w:rPr>
+        <w:t>tenant.phone</w:t>
+      </w:r>
+      <w:proofErr w:type="gramEnd"/>
+      <w:r>
+        <w:rPr>
+          <w:rFonts w:ascii="Times New Roman" w:eastAsia="Times New Roman" w:hAnsi="Times New Roman" w:cs="Times New Roman"/>
+          <w:sz w:val="24"/>
+          <w:szCs w:val="24"/>
+        </w:rPr>
+        <w:t>_number</w:t>
+      </w:r>
+      <w:proofErr w:type="spellEnd"/>
+      <w:r>
+        <w:rPr>
+          <w:rFonts w:ascii="Times New Roman" w:eastAsia="Times New Roman" w:hAnsi="Times New Roman" w:cs="Times New Roman"/>
+          <w:sz w:val="24"/>
+          <w:szCs w:val="24"/>
+        </w:rPr>
+        <w:t>'</w:t>
       </w:r>
       <w:r>
         <w:rPr>
@@ -1319,13 +2057,51 @@
           <w:szCs w:val="24"/>
         </w:rPr>
       </w:pPr>
-      <w:r>
-        <w:rPr>
-          <w:rFonts w:ascii="Times New Roman" w:eastAsia="Times New Roman" w:hAnsi="Times New Roman" w:cs="Times New Roman"/>
-          <w:sz w:val="24"/>
-          <w:szCs w:val="24"/>
-        </w:rPr>
-        <w:t>{{ showifdef('tenant.email'</w:t>
+      <w:proofErr w:type="gramStart"/>
+      <w:r>
+        <w:rPr>
+          <w:rFonts w:ascii="Times New Roman" w:eastAsia="Times New Roman" w:hAnsi="Times New Roman" w:cs="Times New Roman"/>
+          <w:sz w:val="24"/>
+          <w:szCs w:val="24"/>
+        </w:rPr>
+        <w:t xml:space="preserve">{{ </w:t>
+      </w:r>
+      <w:proofErr w:type="spellStart"/>
+      <w:r>
+        <w:rPr>
+          <w:rFonts w:ascii="Times New Roman" w:eastAsia="Times New Roman" w:hAnsi="Times New Roman" w:cs="Times New Roman"/>
+          <w:sz w:val="24"/>
+          <w:szCs w:val="24"/>
+        </w:rPr>
+        <w:t>showifdef</w:t>
+      </w:r>
+      <w:proofErr w:type="spellEnd"/>
+      <w:proofErr w:type="gramEnd"/>
+      <w:r>
+        <w:rPr>
+          <w:rFonts w:ascii="Times New Roman" w:eastAsia="Times New Roman" w:hAnsi="Times New Roman" w:cs="Times New Roman"/>
+          <w:sz w:val="24"/>
+          <w:szCs w:val="24"/>
+        </w:rPr>
+        <w:t>('</w:t>
+      </w:r>
+      <w:proofErr w:type="spellStart"/>
+      <w:r>
+        <w:rPr>
+          <w:rFonts w:ascii="Times New Roman" w:eastAsia="Times New Roman" w:hAnsi="Times New Roman" w:cs="Times New Roman"/>
+          <w:sz w:val="24"/>
+          <w:szCs w:val="24"/>
+        </w:rPr>
+        <w:t>tenant.email</w:t>
+      </w:r>
+      <w:proofErr w:type="spellEnd"/>
+      <w:r>
+        <w:rPr>
+          <w:rFonts w:ascii="Times New Roman" w:eastAsia="Times New Roman" w:hAnsi="Times New Roman" w:cs="Times New Roman"/>
+          <w:sz w:val="24"/>
+          <w:szCs w:val="24"/>
+        </w:rPr>
+        <w:t>'</w:t>
       </w:r>
       <w:r>
         <w:rPr>
@@ -1438,178 +2214,36 @@
           <w:szCs w:val="24"/>
         </w:rPr>
         <w:tab/>
-        <w:t>{%p for additional_person in additional_tenants %}</w:t>
-      </w:r>
-    </w:p>
-    <w:p>
-      <w:pPr>
-        <w:keepNext/>
-        <w:keepLines/>
-        <w:tabs>
-          <w:tab w:val="left" w:pos="270"/>
-          <w:tab w:val="left" w:pos="540"/>
-          <w:tab w:val="left" w:pos="810"/>
-          <w:tab w:val="left" w:pos="1080"/>
-          <w:tab w:val="left" w:pos="4230"/>
-          <w:tab w:val="left" w:pos="4500"/>
-          <w:tab w:val="left" w:pos="5130"/>
-          <w:tab w:val="left" w:pos="6660"/>
-          <w:tab w:val="left" w:pos="6930"/>
-          <w:tab w:val="left" w:pos="7290"/>
-          <w:tab w:val="left" w:pos="7830"/>
-          <w:tab w:val="left" w:pos="8550"/>
-          <w:tab w:val="left" w:pos="9270"/>
-          <w:tab w:val="left" w:pos="9990"/>
-        </w:tabs>
-        <w:spacing w:after="0" w:line="240" w:lineRule="auto"/>
-        <w:rPr>
-          <w:rFonts w:ascii="Times New Roman" w:eastAsia="Times New Roman" w:hAnsi="Times New Roman" w:cs="Times New Roman"/>
-          <w:sz w:val="24"/>
-          <w:szCs w:val="24"/>
-        </w:rPr>
-      </w:pPr>
-      <w:r>
-        <w:rPr>
-          <w:rFonts w:ascii="Times New Roman" w:eastAsia="Times New Roman" w:hAnsi="Times New Roman" w:cs="Times New Roman"/>
-          <w:sz w:val="24"/>
-          <w:szCs w:val="24"/>
-        </w:rPr>
-        <w:tab/>
-      </w:r>
-      <w:r>
-        <w:rPr>
-          <w:rFonts w:ascii="Times New Roman" w:eastAsia="Times New Roman" w:hAnsi="Times New Roman" w:cs="Times New Roman"/>
-          <w:sz w:val="24"/>
-          <w:szCs w:val="24"/>
-        </w:rPr>
-        <w:tab/>
-      </w:r>
-      <w:r>
-        <w:rPr>
-          <w:rFonts w:ascii="Times New Roman" w:eastAsia="Times New Roman" w:hAnsi="Times New Roman" w:cs="Times New Roman"/>
-          <w:sz w:val="24"/>
-          <w:szCs w:val="24"/>
-        </w:rPr>
-        <w:tab/>
-      </w:r>
-      <w:r>
-        <w:rPr>
-          <w:rFonts w:ascii="Times New Roman" w:eastAsia="Times New Roman" w:hAnsi="Times New Roman" w:cs="Times New Roman"/>
-          <w:sz w:val="24"/>
-          <w:szCs w:val="24"/>
-        </w:rPr>
-        <w:tab/>
-      </w:r>
-      <w:r>
-        <w:rPr>
-          <w:rFonts w:ascii="Times New Roman" w:eastAsia="Times New Roman" w:hAnsi="Times New Roman" w:cs="Times New Roman"/>
-          <w:sz w:val="24"/>
-          <w:szCs w:val="24"/>
-        </w:rPr>
-        <w:tab/>
-      </w:r>
-      <w:r>
-        <w:rPr>
-          <w:rFonts w:ascii="Times New Roman" w:eastAsia="Times New Roman" w:hAnsi="Times New Roman" w:cs="Times New Roman"/>
-          <w:sz w:val="24"/>
-          <w:szCs w:val="24"/>
-        </w:rPr>
-        <w:tab/>
-      </w:r>
-      <w:r>
-        <w:rPr>
-          <w:rFonts w:ascii="Times New Roman" w:eastAsia="Times New Roman" w:hAnsi="Times New Roman" w:cs="Times New Roman"/>
-          <w:sz w:val="24"/>
-          <w:szCs w:val="24"/>
-        </w:rPr>
-        <w:tab/>
-        <w:t>{{ additional_person }}, DEFENDANT</w:t>
-      </w:r>
-    </w:p>
-    <w:p>
-      <w:pPr>
-        <w:keepNext/>
-        <w:keepLines/>
-        <w:tabs>
-          <w:tab w:val="left" w:pos="270"/>
-          <w:tab w:val="left" w:pos="540"/>
-          <w:tab w:val="left" w:pos="810"/>
-          <w:tab w:val="left" w:pos="1080"/>
-          <w:tab w:val="left" w:pos="4230"/>
-          <w:tab w:val="left" w:pos="4500"/>
-          <w:tab w:val="left" w:pos="5130"/>
-          <w:tab w:val="left" w:pos="6660"/>
-          <w:tab w:val="left" w:pos="6930"/>
-          <w:tab w:val="left" w:pos="7290"/>
-          <w:tab w:val="left" w:pos="7830"/>
-          <w:tab w:val="left" w:pos="8550"/>
-          <w:tab w:val="left" w:pos="9270"/>
-          <w:tab w:val="left" w:pos="9990"/>
-        </w:tabs>
-        <w:spacing w:after="0" w:line="240" w:lineRule="auto"/>
-        <w:rPr>
-          <w:rFonts w:ascii="Times New Roman" w:eastAsia="Times New Roman" w:hAnsi="Times New Roman" w:cs="Times New Roman"/>
-          <w:sz w:val="24"/>
-          <w:szCs w:val="24"/>
-        </w:rPr>
-      </w:pPr>
-      <w:r>
-        <w:rPr>
-          <w:rFonts w:ascii="Times New Roman" w:eastAsia="Times New Roman" w:hAnsi="Times New Roman" w:cs="Times New Roman"/>
-          <w:sz w:val="24"/>
-          <w:szCs w:val="24"/>
-        </w:rPr>
-        <w:tab/>
-      </w:r>
-      <w:r>
-        <w:rPr>
-          <w:rFonts w:ascii="Times New Roman" w:eastAsia="Times New Roman" w:hAnsi="Times New Roman" w:cs="Times New Roman"/>
-          <w:sz w:val="24"/>
-          <w:szCs w:val="24"/>
-        </w:rPr>
-        <w:tab/>
-      </w:r>
-      <w:r>
-        <w:rPr>
-          <w:rFonts w:ascii="Times New Roman" w:eastAsia="Times New Roman" w:hAnsi="Times New Roman" w:cs="Times New Roman"/>
-          <w:sz w:val="24"/>
-          <w:szCs w:val="24"/>
-        </w:rPr>
-        <w:tab/>
-      </w:r>
-      <w:r>
-        <w:rPr>
-          <w:rFonts w:ascii="Times New Roman" w:eastAsia="Times New Roman" w:hAnsi="Times New Roman" w:cs="Times New Roman"/>
-          <w:sz w:val="24"/>
-          <w:szCs w:val="24"/>
-        </w:rPr>
-        <w:tab/>
-      </w:r>
-      <w:r>
-        <w:rPr>
-          <w:rFonts w:ascii="Times New Roman" w:eastAsia="Times New Roman" w:hAnsi="Times New Roman" w:cs="Times New Roman"/>
-          <w:sz w:val="24"/>
-          <w:szCs w:val="24"/>
-        </w:rPr>
-        <w:tab/>
-      </w:r>
-      <w:r>
-        <w:rPr>
-          <w:rFonts w:ascii="Times New Roman" w:eastAsia="Times New Roman" w:hAnsi="Times New Roman" w:cs="Times New Roman"/>
-          <w:sz w:val="24"/>
-          <w:szCs w:val="24"/>
-        </w:rPr>
-        <w:tab/>
-        <w:t xml:space="preserve">{%p if not defined('signature_choice') or signature_choice in </w:t>
-      </w:r>
-      <w:r>
-        <w:rPr>
-          <w:rFonts w:ascii="Times New Roman" w:eastAsia="Times New Roman" w:hAnsi="Times New Roman" w:cs="Times New Roman"/>
-          <w:sz w:val="24"/>
-          <w:szCs w:val="24"/>
-        </w:rPr>
-        <w:t>['this device','phone']</w:t>
-      </w:r>
+        <w:t xml:space="preserve">{%p for </w:t>
+      </w:r>
+      <w:proofErr w:type="spellStart"/>
+      <w:r>
+        <w:rPr>
+          <w:rFonts w:ascii="Times New Roman" w:eastAsia="Times New Roman" w:hAnsi="Times New Roman" w:cs="Times New Roman"/>
+          <w:sz w:val="24"/>
+          <w:szCs w:val="24"/>
+        </w:rPr>
+        <w:t>additional_person</w:t>
+      </w:r>
+      <w:proofErr w:type="spellEnd"/>
+      <w:r>
+        <w:rPr>
+          <w:rFonts w:ascii="Times New Roman" w:eastAsia="Times New Roman" w:hAnsi="Times New Roman" w:cs="Times New Roman"/>
+          <w:sz w:val="24"/>
+          <w:szCs w:val="24"/>
+        </w:rPr>
+        <w:t xml:space="preserve"> in </w:t>
+      </w:r>
+      <w:proofErr w:type="spellStart"/>
+      <w:r>
+        <w:rPr>
+          <w:rFonts w:ascii="Times New Roman" w:eastAsia="Times New Roman" w:hAnsi="Times New Roman" w:cs="Times New Roman"/>
+          <w:sz w:val="24"/>
+          <w:szCs w:val="24"/>
+        </w:rPr>
+        <w:t>additional_tenants</w:t>
+      </w:r>
+      <w:proofErr w:type="spellEnd"/>
       <w:r>
         <w:rPr>
           <w:rFonts w:ascii="Times New Roman" w:eastAsia="Times New Roman" w:hAnsi="Times New Roman" w:cs="Times New Roman"/>
@@ -1640,6 +2274,273 @@
           <w:tab w:val="left" w:pos="9990"/>
         </w:tabs>
         <w:spacing w:after="0" w:line="240" w:lineRule="auto"/>
+        <w:rPr>
+          <w:rFonts w:ascii="Times New Roman" w:eastAsia="Times New Roman" w:hAnsi="Times New Roman" w:cs="Times New Roman"/>
+          <w:sz w:val="24"/>
+          <w:szCs w:val="24"/>
+        </w:rPr>
+      </w:pPr>
+      <w:r>
+        <w:rPr>
+          <w:rFonts w:ascii="Times New Roman" w:eastAsia="Times New Roman" w:hAnsi="Times New Roman" w:cs="Times New Roman"/>
+          <w:sz w:val="24"/>
+          <w:szCs w:val="24"/>
+        </w:rPr>
+        <w:tab/>
+      </w:r>
+      <w:r>
+        <w:rPr>
+          <w:rFonts w:ascii="Times New Roman" w:eastAsia="Times New Roman" w:hAnsi="Times New Roman" w:cs="Times New Roman"/>
+          <w:sz w:val="24"/>
+          <w:szCs w:val="24"/>
+        </w:rPr>
+        <w:tab/>
+      </w:r>
+      <w:r>
+        <w:rPr>
+          <w:rFonts w:ascii="Times New Roman" w:eastAsia="Times New Roman" w:hAnsi="Times New Roman" w:cs="Times New Roman"/>
+          <w:sz w:val="24"/>
+          <w:szCs w:val="24"/>
+        </w:rPr>
+        <w:tab/>
+      </w:r>
+      <w:r>
+        <w:rPr>
+          <w:rFonts w:ascii="Times New Roman" w:eastAsia="Times New Roman" w:hAnsi="Times New Roman" w:cs="Times New Roman"/>
+          <w:sz w:val="24"/>
+          <w:szCs w:val="24"/>
+        </w:rPr>
+        <w:tab/>
+      </w:r>
+      <w:r>
+        <w:rPr>
+          <w:rFonts w:ascii="Times New Roman" w:eastAsia="Times New Roman" w:hAnsi="Times New Roman" w:cs="Times New Roman"/>
+          <w:sz w:val="24"/>
+          <w:szCs w:val="24"/>
+        </w:rPr>
+        <w:tab/>
+      </w:r>
+      <w:r>
+        <w:rPr>
+          <w:rFonts w:ascii="Times New Roman" w:eastAsia="Times New Roman" w:hAnsi="Times New Roman" w:cs="Times New Roman"/>
+          <w:sz w:val="24"/>
+          <w:szCs w:val="24"/>
+        </w:rPr>
+        <w:tab/>
+      </w:r>
+      <w:r>
+        <w:rPr>
+          <w:rFonts w:ascii="Times New Roman" w:eastAsia="Times New Roman" w:hAnsi="Times New Roman" w:cs="Times New Roman"/>
+          <w:sz w:val="24"/>
+          <w:szCs w:val="24"/>
+        </w:rPr>
+        <w:tab/>
+      </w:r>
+      <w:proofErr w:type="gramStart"/>
+      <w:r>
+        <w:rPr>
+          <w:rFonts w:ascii="Times New Roman" w:eastAsia="Times New Roman" w:hAnsi="Times New Roman" w:cs="Times New Roman"/>
+          <w:sz w:val="24"/>
+          <w:szCs w:val="24"/>
+        </w:rPr>
+        <w:t xml:space="preserve">{{ </w:t>
+      </w:r>
+      <w:proofErr w:type="spellStart"/>
+      <w:r>
+        <w:rPr>
+          <w:rFonts w:ascii="Times New Roman" w:eastAsia="Times New Roman" w:hAnsi="Times New Roman" w:cs="Times New Roman"/>
+          <w:sz w:val="24"/>
+          <w:szCs w:val="24"/>
+        </w:rPr>
+        <w:t>additional</w:t>
+      </w:r>
+      <w:proofErr w:type="gramEnd"/>
+      <w:r>
+        <w:rPr>
+          <w:rFonts w:ascii="Times New Roman" w:eastAsia="Times New Roman" w:hAnsi="Times New Roman" w:cs="Times New Roman"/>
+          <w:sz w:val="24"/>
+          <w:szCs w:val="24"/>
+        </w:rPr>
+        <w:t>_person</w:t>
+      </w:r>
+      <w:proofErr w:type="spellEnd"/>
+      <w:r>
+        <w:rPr>
+          <w:rFonts w:ascii="Times New Roman" w:eastAsia="Times New Roman" w:hAnsi="Times New Roman" w:cs="Times New Roman"/>
+          <w:sz w:val="24"/>
+          <w:szCs w:val="24"/>
+        </w:rPr>
+        <w:t xml:space="preserve"> }}, DEFENDANT</w:t>
+      </w:r>
+    </w:p>
+    <w:p>
+      <w:pPr>
+        <w:keepNext/>
+        <w:keepLines/>
+        <w:tabs>
+          <w:tab w:val="left" w:pos="270"/>
+          <w:tab w:val="left" w:pos="540"/>
+          <w:tab w:val="left" w:pos="810"/>
+          <w:tab w:val="left" w:pos="1080"/>
+          <w:tab w:val="left" w:pos="4230"/>
+          <w:tab w:val="left" w:pos="4500"/>
+          <w:tab w:val="left" w:pos="5130"/>
+          <w:tab w:val="left" w:pos="6660"/>
+          <w:tab w:val="left" w:pos="6930"/>
+          <w:tab w:val="left" w:pos="7290"/>
+          <w:tab w:val="left" w:pos="7830"/>
+          <w:tab w:val="left" w:pos="8550"/>
+          <w:tab w:val="left" w:pos="9270"/>
+          <w:tab w:val="left" w:pos="9990"/>
+        </w:tabs>
+        <w:spacing w:after="0" w:line="240" w:lineRule="auto"/>
+        <w:rPr>
+          <w:rFonts w:ascii="Times New Roman" w:eastAsia="Times New Roman" w:hAnsi="Times New Roman" w:cs="Times New Roman"/>
+          <w:sz w:val="24"/>
+          <w:szCs w:val="24"/>
+        </w:rPr>
+      </w:pPr>
+      <w:r>
+        <w:rPr>
+          <w:rFonts w:ascii="Times New Roman" w:eastAsia="Times New Roman" w:hAnsi="Times New Roman" w:cs="Times New Roman"/>
+          <w:sz w:val="24"/>
+          <w:szCs w:val="24"/>
+        </w:rPr>
+        <w:tab/>
+      </w:r>
+      <w:r>
+        <w:rPr>
+          <w:rFonts w:ascii="Times New Roman" w:eastAsia="Times New Roman" w:hAnsi="Times New Roman" w:cs="Times New Roman"/>
+          <w:sz w:val="24"/>
+          <w:szCs w:val="24"/>
+        </w:rPr>
+        <w:tab/>
+      </w:r>
+      <w:r>
+        <w:rPr>
+          <w:rFonts w:ascii="Times New Roman" w:eastAsia="Times New Roman" w:hAnsi="Times New Roman" w:cs="Times New Roman"/>
+          <w:sz w:val="24"/>
+          <w:szCs w:val="24"/>
+        </w:rPr>
+        <w:tab/>
+      </w:r>
+      <w:r>
+        <w:rPr>
+          <w:rFonts w:ascii="Times New Roman" w:eastAsia="Times New Roman" w:hAnsi="Times New Roman" w:cs="Times New Roman"/>
+          <w:sz w:val="24"/>
+          <w:szCs w:val="24"/>
+        </w:rPr>
+        <w:tab/>
+      </w:r>
+      <w:r>
+        <w:rPr>
+          <w:rFonts w:ascii="Times New Roman" w:eastAsia="Times New Roman" w:hAnsi="Times New Roman" w:cs="Times New Roman"/>
+          <w:sz w:val="24"/>
+          <w:szCs w:val="24"/>
+        </w:rPr>
+        <w:tab/>
+      </w:r>
+      <w:r>
+        <w:rPr>
+          <w:rFonts w:ascii="Times New Roman" w:eastAsia="Times New Roman" w:hAnsi="Times New Roman" w:cs="Times New Roman"/>
+          <w:sz w:val="24"/>
+          <w:szCs w:val="24"/>
+        </w:rPr>
+        <w:tab/>
+        <w:t>{%p if not defined('</w:t>
+      </w:r>
+      <w:proofErr w:type="spellStart"/>
+      <w:r>
+        <w:rPr>
+          <w:rFonts w:ascii="Times New Roman" w:eastAsia="Times New Roman" w:hAnsi="Times New Roman" w:cs="Times New Roman"/>
+          <w:sz w:val="24"/>
+          <w:szCs w:val="24"/>
+        </w:rPr>
+        <w:t>signature_choice</w:t>
+      </w:r>
+      <w:proofErr w:type="spellEnd"/>
+      <w:r>
+        <w:rPr>
+          <w:rFonts w:ascii="Times New Roman" w:eastAsia="Times New Roman" w:hAnsi="Times New Roman" w:cs="Times New Roman"/>
+          <w:sz w:val="24"/>
+          <w:szCs w:val="24"/>
+        </w:rPr>
+        <w:t xml:space="preserve">') or </w:t>
+      </w:r>
+      <w:proofErr w:type="spellStart"/>
+      <w:r>
+        <w:rPr>
+          <w:rFonts w:ascii="Times New Roman" w:eastAsia="Times New Roman" w:hAnsi="Times New Roman" w:cs="Times New Roman"/>
+          <w:sz w:val="24"/>
+          <w:szCs w:val="24"/>
+        </w:rPr>
+        <w:t>signature_choice</w:t>
+      </w:r>
+      <w:proofErr w:type="spellEnd"/>
+      <w:r>
+        <w:rPr>
+          <w:rFonts w:ascii="Times New Roman" w:eastAsia="Times New Roman" w:hAnsi="Times New Roman" w:cs="Times New Roman"/>
+          <w:sz w:val="24"/>
+          <w:szCs w:val="24"/>
+        </w:rPr>
+        <w:t xml:space="preserve"> in </w:t>
+      </w:r>
+      <w:r>
+        <w:rPr>
+          <w:rFonts w:ascii="Times New Roman" w:eastAsia="Times New Roman" w:hAnsi="Times New Roman" w:cs="Times New Roman"/>
+          <w:sz w:val="24"/>
+          <w:szCs w:val="24"/>
+        </w:rPr>
+        <w:t xml:space="preserve">['this </w:t>
+      </w:r>
+      <w:proofErr w:type="spellStart"/>
+      <w:r>
+        <w:rPr>
+          <w:rFonts w:ascii="Times New Roman" w:eastAsia="Times New Roman" w:hAnsi="Times New Roman" w:cs="Times New Roman"/>
+          <w:sz w:val="24"/>
+          <w:szCs w:val="24"/>
+        </w:rPr>
+        <w:t>device','phone</w:t>
+      </w:r>
+      <w:proofErr w:type="spellEnd"/>
+      <w:r>
+        <w:rPr>
+          <w:rFonts w:ascii="Times New Roman" w:eastAsia="Times New Roman" w:hAnsi="Times New Roman" w:cs="Times New Roman"/>
+          <w:sz w:val="24"/>
+          <w:szCs w:val="24"/>
+        </w:rPr>
+        <w:t>']</w:t>
+      </w:r>
+      <w:r>
+        <w:rPr>
+          <w:rFonts w:ascii="Times New Roman" w:eastAsia="Times New Roman" w:hAnsi="Times New Roman" w:cs="Times New Roman"/>
+          <w:sz w:val="24"/>
+          <w:szCs w:val="24"/>
+        </w:rPr>
+        <w:t xml:space="preserve"> %}</w:t>
+      </w:r>
+    </w:p>
+    <w:p>
+      <w:pPr>
+        <w:keepNext/>
+        <w:keepLines/>
+        <w:tabs>
+          <w:tab w:val="left" w:pos="270"/>
+          <w:tab w:val="left" w:pos="540"/>
+          <w:tab w:val="left" w:pos="810"/>
+          <w:tab w:val="left" w:pos="1080"/>
+          <w:tab w:val="left" w:pos="4230"/>
+          <w:tab w:val="left" w:pos="4500"/>
+          <w:tab w:val="left" w:pos="5130"/>
+          <w:tab w:val="left" w:pos="6660"/>
+          <w:tab w:val="left" w:pos="6930"/>
+          <w:tab w:val="left" w:pos="7290"/>
+          <w:tab w:val="left" w:pos="7830"/>
+          <w:tab w:val="left" w:pos="8550"/>
+          <w:tab w:val="left" w:pos="9270"/>
+          <w:tab w:val="left" w:pos="9990"/>
+        </w:tabs>
+        <w:spacing w:after="0" w:line="240" w:lineRule="auto"/>
         <w:ind w:left="5040"/>
         <w:rPr>
           <w:rFonts w:ascii="Times New Roman" w:eastAsia="Times New Roman" w:hAnsi="Times New Roman" w:cs="Times New Roman"/>
@@ -1647,6 +2548,7 @@
           <w:szCs w:val="24"/>
         </w:rPr>
       </w:pPr>
+      <w:proofErr w:type="gramStart"/>
       <w:r>
         <w:rPr>
           <w:rFonts w:ascii="Times New Roman" w:eastAsia="Times New Roman" w:hAnsi="Times New Roman" w:cs="Times New Roman"/>
@@ -1655,21 +2557,40 @@
         </w:rPr>
         <w:t xml:space="preserve">{{ </w:t>
       </w:r>
-      <w:r>
-        <w:rPr>
-          <w:rFonts w:ascii="Times New Roman" w:eastAsia="Times New Roman" w:hAnsi="Times New Roman" w:cs="Times New Roman"/>
-          <w:sz w:val="24"/>
-          <w:szCs w:val="24"/>
-        </w:rPr>
-        <w:t>additional_person</w:t>
-      </w:r>
-      <w:r>
-        <w:rPr>
-          <w:rFonts w:ascii="Times New Roman" w:eastAsia="Times New Roman" w:hAnsi="Times New Roman" w:cs="Times New Roman"/>
-          <w:sz w:val="24"/>
-          <w:szCs w:val="24"/>
-        </w:rPr>
-        <w:t>.signature }}</w:t>
+      <w:proofErr w:type="spellStart"/>
+      <w:r>
+        <w:rPr>
+          <w:rFonts w:ascii="Times New Roman" w:eastAsia="Times New Roman" w:hAnsi="Times New Roman" w:cs="Times New Roman"/>
+          <w:sz w:val="24"/>
+          <w:szCs w:val="24"/>
+        </w:rPr>
+        <w:t>additional</w:t>
+      </w:r>
+      <w:proofErr w:type="gramEnd"/>
+      <w:r>
+        <w:rPr>
+          <w:rFonts w:ascii="Times New Roman" w:eastAsia="Times New Roman" w:hAnsi="Times New Roman" w:cs="Times New Roman"/>
+          <w:sz w:val="24"/>
+          <w:szCs w:val="24"/>
+        </w:rPr>
+        <w:t>_person</w:t>
+      </w:r>
+      <w:r>
+        <w:rPr>
+          <w:rFonts w:ascii="Times New Roman" w:eastAsia="Times New Roman" w:hAnsi="Times New Roman" w:cs="Times New Roman"/>
+          <w:sz w:val="24"/>
+          <w:szCs w:val="24"/>
+        </w:rPr>
+        <w:t>.signature</w:t>
+      </w:r>
+      <w:proofErr w:type="spellEnd"/>
+      <w:r>
+        <w:rPr>
+          <w:rFonts w:ascii="Times New Roman" w:eastAsia="Times New Roman" w:hAnsi="Times New Roman" w:cs="Times New Roman"/>
+          <w:sz w:val="24"/>
+          <w:szCs w:val="24"/>
+        </w:rPr>
+        <w:t xml:space="preserve"> }}</w:t>
       </w:r>
     </w:p>
     <w:p>
@@ -2002,21 +2923,49 @@
           <w:szCs w:val="24"/>
         </w:rPr>
       </w:pPr>
-      <w:r>
-        <w:rPr>
-          <w:rFonts w:ascii="Times New Roman" w:eastAsia="Times New Roman" w:hAnsi="Times New Roman" w:cs="Times New Roman"/>
-          <w:sz w:val="24"/>
-          <w:szCs w:val="24"/>
-        </w:rPr>
-        <w:t>{{ additional_person</w:t>
-      </w:r>
-      <w:r>
-        <w:rPr>
-          <w:rFonts w:ascii="Times New Roman" w:eastAsia="Times New Roman" w:hAnsi="Times New Roman" w:cs="Times New Roman"/>
-          <w:sz w:val="24"/>
-          <w:szCs w:val="24"/>
-        </w:rPr>
-        <w:t>.address_block()</w:t>
+      <w:proofErr w:type="gramStart"/>
+      <w:r>
+        <w:rPr>
+          <w:rFonts w:ascii="Times New Roman" w:eastAsia="Times New Roman" w:hAnsi="Times New Roman" w:cs="Times New Roman"/>
+          <w:sz w:val="24"/>
+          <w:szCs w:val="24"/>
+        </w:rPr>
+        <w:t xml:space="preserve">{{ </w:t>
+      </w:r>
+      <w:proofErr w:type="spellStart"/>
+      <w:r>
+        <w:rPr>
+          <w:rFonts w:ascii="Times New Roman" w:eastAsia="Times New Roman" w:hAnsi="Times New Roman" w:cs="Times New Roman"/>
+          <w:sz w:val="24"/>
+          <w:szCs w:val="24"/>
+        </w:rPr>
+        <w:t>additional</w:t>
+      </w:r>
+      <w:proofErr w:type="gramEnd"/>
+      <w:r>
+        <w:rPr>
+          <w:rFonts w:ascii="Times New Roman" w:eastAsia="Times New Roman" w:hAnsi="Times New Roman" w:cs="Times New Roman"/>
+          <w:sz w:val="24"/>
+          <w:szCs w:val="24"/>
+        </w:rPr>
+        <w:t>_person</w:t>
+      </w:r>
+      <w:r>
+        <w:rPr>
+          <w:rFonts w:ascii="Times New Roman" w:eastAsia="Times New Roman" w:hAnsi="Times New Roman" w:cs="Times New Roman"/>
+          <w:sz w:val="24"/>
+          <w:szCs w:val="24"/>
+        </w:rPr>
+        <w:t>.address_block</w:t>
+      </w:r>
+      <w:proofErr w:type="spellEnd"/>
+      <w:r>
+        <w:rPr>
+          <w:rFonts w:ascii="Times New Roman" w:eastAsia="Times New Roman" w:hAnsi="Times New Roman" w:cs="Times New Roman"/>
+          <w:sz w:val="24"/>
+          <w:szCs w:val="24"/>
+        </w:rPr>
+        <w:t>()</w:t>
       </w:r>
       <w:r>
         <w:rPr>
@@ -2060,149 +3009,144 @@
           <w:sz w:val="24"/>
           <w:szCs w:val="24"/>
         </w:rPr>
-        <w:tab/>
-      </w:r>
-      <w:r>
-        <w:rPr>
-          <w:rFonts w:ascii="Times New Roman" w:eastAsia="Times New Roman" w:hAnsi="Times New Roman" w:cs="Times New Roman"/>
-          <w:sz w:val="24"/>
-          <w:szCs w:val="24"/>
-        </w:rPr>
-        <w:tab/>
-      </w:r>
-      <w:r>
-        <w:rPr>
-          <w:rFonts w:ascii="Times New Roman" w:eastAsia="Times New Roman" w:hAnsi="Times New Roman" w:cs="Times New Roman"/>
-          <w:sz w:val="24"/>
-          <w:szCs w:val="24"/>
-        </w:rPr>
-        <w:tab/>
-      </w:r>
-      <w:r>
-        <w:rPr>
-          <w:rFonts w:ascii="Times New Roman" w:eastAsia="Times New Roman" w:hAnsi="Times New Roman" w:cs="Times New Roman"/>
-          <w:sz w:val="24"/>
-          <w:szCs w:val="24"/>
-        </w:rPr>
-        <w:tab/>
-      </w:r>
-      <w:r>
-        <w:rPr>
-          <w:rFonts w:ascii="Times New Roman" w:eastAsia="Times New Roman" w:hAnsi="Times New Roman" w:cs="Times New Roman"/>
-          <w:sz w:val="24"/>
-          <w:szCs w:val="24"/>
-        </w:rPr>
-        <w:tab/>
-      </w:r>
-      <w:r>
-        <w:rPr>
-          <w:rFonts w:ascii="Times New Roman" w:eastAsia="Times New Roman" w:hAnsi="Times New Roman" w:cs="Times New Roman"/>
-          <w:sz w:val="24"/>
-          <w:szCs w:val="24"/>
-        </w:rPr>
-        <w:tab/>
-        <w:t>{%p endfor %}</w:t>
-      </w:r>
-    </w:p>
-    <w:p>
-      <w:pPr>
-        <w:keepNext/>
-        <w:keepLines/>
-        <w:tabs>
-          <w:tab w:val="left" w:pos="270"/>
-          <w:tab w:val="left" w:pos="540"/>
-          <w:tab w:val="left" w:pos="810"/>
-          <w:tab w:val="left" w:pos="1080"/>
-          <w:tab w:val="left" w:pos="4230"/>
-          <w:tab w:val="left" w:pos="4500"/>
-          <w:tab w:val="left" w:pos="5130"/>
-          <w:tab w:val="left" w:pos="6660"/>
-          <w:tab w:val="left" w:pos="6930"/>
-          <w:tab w:val="left" w:pos="7290"/>
-          <w:tab w:val="left" w:pos="7830"/>
-          <w:tab w:val="left" w:pos="8550"/>
-          <w:tab w:val="left" w:pos="9270"/>
-          <w:tab w:val="left" w:pos="9990"/>
-        </w:tabs>
-        <w:spacing w:after="0" w:line="240" w:lineRule="auto"/>
-        <w:rPr>
-          <w:rFonts w:ascii="Times New Roman" w:eastAsia="Times New Roman" w:hAnsi="Times New Roman" w:cs="Times New Roman"/>
-          <w:sz w:val="24"/>
-          <w:szCs w:val="24"/>
-        </w:rPr>
-      </w:pPr>
-      <w:r>
-        <w:rPr>
-          <w:rFonts w:ascii="Times New Roman" w:eastAsia="Times New Roman" w:hAnsi="Times New Roman" w:cs="Times New Roman"/>
-          <w:sz w:val="24"/>
-          <w:szCs w:val="24"/>
-        </w:rPr>
-        <w:tab/>
-      </w:r>
-      <w:r>
-        <w:rPr>
-          <w:rFonts w:ascii="Times New Roman" w:eastAsia="Times New Roman" w:hAnsi="Times New Roman" w:cs="Times New Roman"/>
-          <w:sz w:val="24"/>
-          <w:szCs w:val="24"/>
-        </w:rPr>
-        <w:tab/>
-      </w:r>
-      <w:r>
-        <w:rPr>
-          <w:rFonts w:ascii="Times New Roman" w:eastAsia="Times New Roman" w:hAnsi="Times New Roman" w:cs="Times New Roman"/>
-          <w:sz w:val="24"/>
-          <w:szCs w:val="24"/>
-        </w:rPr>
-        <w:tab/>
-      </w:r>
-      <w:r>
-        <w:rPr>
-          <w:rFonts w:ascii="Times New Roman" w:eastAsia="Times New Roman" w:hAnsi="Times New Roman" w:cs="Times New Roman"/>
-          <w:sz w:val="24"/>
-          <w:szCs w:val="24"/>
-        </w:rPr>
-        <w:tab/>
-      </w:r>
-      <w:r>
-        <w:rPr>
-          <w:rFonts w:ascii="Times New Roman" w:eastAsia="Times New Roman" w:hAnsi="Times New Roman" w:cs="Times New Roman"/>
-          <w:sz w:val="24"/>
-          <w:szCs w:val="24"/>
-        </w:rPr>
-        <w:tab/>
-      </w:r>
-      <w:r>
-        <w:rPr>
-          <w:rFonts w:ascii="Times New Roman" w:eastAsia="Times New Roman" w:hAnsi="Times New Roman" w:cs="Times New Roman"/>
-          <w:sz w:val="24"/>
-          <w:szCs w:val="24"/>
-        </w:rPr>
-        <w:tab/>
-        <w:t xml:space="preserve">{%p endif %} </w:t>
-      </w:r>
-      <w:r>
-        <w:rPr>
-          <w:rFonts w:ascii="Times New Roman" w:eastAsia="Times New Roman" w:hAnsi="Times New Roman" w:cs="Times New Roman"/>
-          <w:sz w:val="24"/>
-          <w:szCs w:val="24"/>
-        </w:rPr>
-        <w:t xml:space="preserve">{# </w:t>
-      </w:r>
-      <w:r>
-        <w:rPr>
-          <w:rFonts w:ascii="Times New Roman" w:eastAsia="Times New Roman" w:hAnsi="Times New Roman" w:cs="Times New Roman"/>
-          <w:sz w:val="24"/>
-          <w:szCs w:val="24"/>
-        </w:rPr>
-        <w:t xml:space="preserve">end </w:t>
-      </w:r>
-      <w:r>
-        <w:rPr>
-          <w:rFonts w:ascii="Times New Roman" w:eastAsia="Times New Roman" w:hAnsi="Times New Roman" w:cs="Times New Roman"/>
-          <w:sz w:val="24"/>
-          <w:szCs w:val="24"/>
-        </w:rPr>
-        <w:t>pro se tenant #}</w:t>
+        <w:lastRenderedPageBreak/>
+        <w:tab/>
+      </w:r>
+      <w:r>
+        <w:rPr>
+          <w:rFonts w:ascii="Times New Roman" w:eastAsia="Times New Roman" w:hAnsi="Times New Roman" w:cs="Times New Roman"/>
+          <w:sz w:val="24"/>
+          <w:szCs w:val="24"/>
+        </w:rPr>
+        <w:tab/>
+      </w:r>
+      <w:r>
+        <w:rPr>
+          <w:rFonts w:ascii="Times New Roman" w:eastAsia="Times New Roman" w:hAnsi="Times New Roman" w:cs="Times New Roman"/>
+          <w:sz w:val="24"/>
+          <w:szCs w:val="24"/>
+        </w:rPr>
+        <w:tab/>
+      </w:r>
+      <w:r>
+        <w:rPr>
+          <w:rFonts w:ascii="Times New Roman" w:eastAsia="Times New Roman" w:hAnsi="Times New Roman" w:cs="Times New Roman"/>
+          <w:sz w:val="24"/>
+          <w:szCs w:val="24"/>
+        </w:rPr>
+        <w:tab/>
+      </w:r>
+      <w:r>
+        <w:rPr>
+          <w:rFonts w:ascii="Times New Roman" w:eastAsia="Times New Roman" w:hAnsi="Times New Roman" w:cs="Times New Roman"/>
+          <w:sz w:val="24"/>
+          <w:szCs w:val="24"/>
+        </w:rPr>
+        <w:tab/>
+      </w:r>
+      <w:r>
+        <w:rPr>
+          <w:rFonts w:ascii="Times New Roman" w:eastAsia="Times New Roman" w:hAnsi="Times New Roman" w:cs="Times New Roman"/>
+          <w:sz w:val="24"/>
+          <w:szCs w:val="24"/>
+        </w:rPr>
+        <w:tab/>
+        <w:t xml:space="preserve">{%p </w:t>
+      </w:r>
+      <w:proofErr w:type="spellStart"/>
+      <w:r>
+        <w:rPr>
+          <w:rFonts w:ascii="Times New Roman" w:eastAsia="Times New Roman" w:hAnsi="Times New Roman" w:cs="Times New Roman"/>
+          <w:sz w:val="24"/>
+          <w:szCs w:val="24"/>
+        </w:rPr>
+        <w:t>endfor</w:t>
+      </w:r>
+      <w:proofErr w:type="spellEnd"/>
+      <w:r>
+        <w:rPr>
+          <w:rFonts w:ascii="Times New Roman" w:eastAsia="Times New Roman" w:hAnsi="Times New Roman" w:cs="Times New Roman"/>
+          <w:sz w:val="24"/>
+          <w:szCs w:val="24"/>
+        </w:rPr>
+        <w:t xml:space="preserve"> %}</w:t>
+      </w:r>
+    </w:p>
+    <w:p>
+      <w:pPr>
+        <w:keepNext/>
+        <w:keepLines/>
+        <w:tabs>
+          <w:tab w:val="left" w:pos="270"/>
+          <w:tab w:val="left" w:pos="540"/>
+          <w:tab w:val="left" w:pos="810"/>
+          <w:tab w:val="left" w:pos="1080"/>
+          <w:tab w:val="left" w:pos="4230"/>
+          <w:tab w:val="left" w:pos="4500"/>
+          <w:tab w:val="left" w:pos="5130"/>
+          <w:tab w:val="left" w:pos="6660"/>
+          <w:tab w:val="left" w:pos="6930"/>
+          <w:tab w:val="left" w:pos="7290"/>
+          <w:tab w:val="left" w:pos="7830"/>
+          <w:tab w:val="left" w:pos="8550"/>
+          <w:tab w:val="left" w:pos="9270"/>
+          <w:tab w:val="left" w:pos="9990"/>
+        </w:tabs>
+        <w:spacing w:after="0" w:line="240" w:lineRule="auto"/>
+        <w:rPr>
+          <w:rFonts w:ascii="Times New Roman" w:eastAsia="Times New Roman" w:hAnsi="Times New Roman" w:cs="Times New Roman"/>
+          <w:sz w:val="24"/>
+          <w:szCs w:val="24"/>
+        </w:rPr>
+      </w:pPr>
+      <w:r>
+        <w:rPr>
+          <w:rFonts w:ascii="Times New Roman" w:eastAsia="Times New Roman" w:hAnsi="Times New Roman" w:cs="Times New Roman"/>
+          <w:sz w:val="24"/>
+          <w:szCs w:val="24"/>
+        </w:rPr>
+        <w:tab/>
+      </w:r>
+      <w:r>
+        <w:rPr>
+          <w:rFonts w:ascii="Times New Roman" w:eastAsia="Times New Roman" w:hAnsi="Times New Roman" w:cs="Times New Roman"/>
+          <w:sz w:val="24"/>
+          <w:szCs w:val="24"/>
+        </w:rPr>
+        <w:tab/>
+      </w:r>
+      <w:r>
+        <w:rPr>
+          <w:rFonts w:ascii="Times New Roman" w:eastAsia="Times New Roman" w:hAnsi="Times New Roman" w:cs="Times New Roman"/>
+          <w:sz w:val="24"/>
+          <w:szCs w:val="24"/>
+        </w:rPr>
+        <w:tab/>
+      </w:r>
+      <w:r>
+        <w:rPr>
+          <w:rFonts w:ascii="Times New Roman" w:eastAsia="Times New Roman" w:hAnsi="Times New Roman" w:cs="Times New Roman"/>
+          <w:sz w:val="24"/>
+          <w:szCs w:val="24"/>
+        </w:rPr>
+        <w:tab/>
+      </w:r>
+      <w:r>
+        <w:rPr>
+          <w:rFonts w:ascii="Times New Roman" w:eastAsia="Times New Roman" w:hAnsi="Times New Roman" w:cs="Times New Roman"/>
+          <w:sz w:val="24"/>
+          <w:szCs w:val="24"/>
+        </w:rPr>
+        <w:tab/>
+      </w:r>
+      <w:r>
+        <w:rPr>
+          <w:rFonts w:ascii="Times New Roman" w:eastAsia="Times New Roman" w:hAnsi="Times New Roman" w:cs="Times New Roman"/>
+          <w:sz w:val="24"/>
+          <w:szCs w:val="24"/>
+        </w:rPr>
+        <w:tab/>
+        <w:t>{%p endif %} {# end pro se tenant #}</w:t>
       </w:r>
     </w:p>
     <w:sectPr>
@@ -2218,7 +3162,7 @@
 </file>
 
 <file path=word/styles.xml><?xml version="1.0" encoding="utf-8"?>
-<w:styles xmlns:mc="http://schemas.openxmlformats.org/markup-compatibility/2006" xmlns:r="http://schemas.openxmlformats.org/officeDocument/2006/relationships" xmlns:w="http://schemas.openxmlformats.org/wordprocessingml/2006/main" xmlns:w14="http://schemas.microsoft.com/office/word/2010/wordml" xmlns:w15="http://schemas.microsoft.com/office/word/2012/wordml" xmlns:w16se="http://schemas.microsoft.com/office/word/2015/wordml/symex" mc:Ignorable="w14 w15 w16se">
+<w:styles xmlns:mc="http://schemas.openxmlformats.org/markup-compatibility/2006" xmlns:r="http://schemas.openxmlformats.org/officeDocument/2006/relationships" xmlns:w="http://schemas.openxmlformats.org/wordprocessingml/2006/main" xmlns:w14="http://schemas.microsoft.com/office/word/2010/wordml" xmlns:w15="http://schemas.microsoft.com/office/word/2012/wordml" xmlns:w16cex="http://schemas.microsoft.com/office/word/2018/wordml/cex" xmlns:w16cid="http://schemas.microsoft.com/office/word/2016/wordml/cid" xmlns:w16="http://schemas.microsoft.com/office/word/2018/wordml" xmlns:w16sdtdh="http://schemas.microsoft.com/office/word/2020/wordml/sdtdatahash" xmlns:w16se="http://schemas.microsoft.com/office/word/2015/wordml/symex" mc:Ignorable="w14 w15 w16se w16cid w16 w16cex w16sdtdh">
   <w:docDefaults>
     <w:rPrDefault>
       <w:rPr>
@@ -2234,7 +3178,7 @@
       </w:pPr>
     </w:pPrDefault>
   </w:docDefaults>
-  <w:latentStyles w:defLockedState="0" w:defUIPriority="99" w:defSemiHidden="0" w:defUnhideWhenUsed="0" w:defQFormat="0" w:count="371">
+  <w:latentStyles w:defLockedState="0" w:defUIPriority="99" w:defSemiHidden="0" w:defUnhideWhenUsed="0" w:defQFormat="0" w:count="376">
     <w:lsdException w:name="Normal" w:uiPriority="0" w:qFormat="1"/>
     <w:lsdException w:name="heading 1" w:uiPriority="9" w:qFormat="1"/>
     <w:lsdException w:name="heading 2" w:semiHidden="1" w:uiPriority="9" w:unhideWhenUsed="1" w:qFormat="1"/>
@@ -2606,6 +3550,11 @@
     <w:lsdException w:name="List Table 5 Dark Accent 6" w:uiPriority="50"/>
     <w:lsdException w:name="List Table 6 Colorful Accent 6" w:uiPriority="51"/>
     <w:lsdException w:name="List Table 7 Colorful Accent 6" w:uiPriority="52"/>
+    <w:lsdException w:name="Mention" w:semiHidden="1" w:unhideWhenUsed="1"/>
+    <w:lsdException w:name="Smart Hyperlink" w:semiHidden="1" w:unhideWhenUsed="1"/>
+    <w:lsdException w:name="Hashtag" w:semiHidden="1" w:unhideWhenUsed="1"/>
+    <w:lsdException w:name="Unresolved Mention" w:semiHidden="1" w:unhideWhenUsed="1"/>
+    <w:lsdException w:name="Smart Link" w:semiHidden="1" w:unhideWhenUsed="1"/>
   </w:latentStyles>
   <w:style w:type="paragraph" w:default="1" w:styleId="Normal">
     <w:name w:val="Normal"/>

</xml_diff>